<commit_message>
CV: add agentic TS forecasting to research interests and LG AI Research tasks
</commit_message>
<xml_diff>
--- a/SeunghanLee_CV.docx
+++ b/SeunghanLee_CV.docx
@@ -1343,6 +1343,32 @@
           <w:sz w:val="24"/>
           <w:u w:val="none"/>
         </w:rPr>
+        <w:t>Agentic Time Series Forecasting</w:t>
+      </w:r>
+    </w:p>
+    <w:p>
+      <w:pPr>
+        <w:spacing w:before="0" w:after="0"/>
+        <w:ind w:left="850" w:hanging="255"/>
+      </w:pPr>
+      <w:r>
+        <w:rPr>
+          <w:rFonts w:ascii="Gulim" w:hAnsi="Gulim" w:eastAsia="Gulim"/>
+          <w:b w:val="0"/>
+          <w:i w:val="0"/>
+          <w:sz w:val="24"/>
+          <w:u w:val="none"/>
+        </w:rPr>
+        <w:t xml:space="preserve">o  </w:t>
+      </w:r>
+      <w:r>
+        <w:rPr>
+          <w:rFonts w:ascii="Gulim" w:hAnsi="Gulim" w:eastAsia="Gulim"/>
+          <w:b w:val="0"/>
+          <w:i w:val="0"/>
+          <w:sz w:val="24"/>
+          <w:u w:val="none"/>
+        </w:rPr>
         <w:t>Time Series Foundation Models</w:t>
       </w:r>
     </w:p>
@@ -3578,7 +3604,7 @@
     </w:p>
     <w:p>
       <w:pPr>
-        <w:spacing w:before="0" w:after="200"/>
+        <w:spacing w:before="0" w:after="60"/>
       </w:pPr>
       <w:r>
         <w:rPr>
@@ -3851,43 +3877,33 @@
           <w:sz w:val="24"/>
           <w:u w:val="none"/>
         </w:rPr>
-        <w:t>④ Supply Chain Knowledge Graph</w:t>
+        <w:t>④ Agentic TS forecasting</w:t>
       </w:r>
     </w:p>
     <w:p>
       <w:pPr>
         <w:spacing w:before="0" w:after="0"/>
-        <w:ind w:left="425" w:hanging="255"/>
-      </w:pPr>
-      <w:r>
-        <w:rPr>
-          <w:rFonts w:ascii="Gulim" w:hAnsi="Gulim" w:eastAsia="Gulim"/>
-          <w:b w:val="0"/>
-          <w:i w:val="0"/>
-          <w:sz w:val="24"/>
-          <w:u w:val="none"/>
-        </w:rPr>
-        <w:t xml:space="preserve">• </w:t>
-      </w:r>
-      <w:r>
-        <w:rPr>
-          <w:rFonts w:ascii="Gulim" w:hAnsi="Gulim" w:eastAsia="Gulim"/>
-          <w:b/>
-          <w:i w:val="0"/>
-          <w:sz w:val="24"/>
-          <w:u w:val="none"/>
-        </w:rPr>
-        <w:t>Key Algorithms</w:t>
-      </w:r>
-      <w:r>
-        <w:rPr>
-          <w:rFonts w:ascii="Gulim" w:hAnsi="Gulim" w:eastAsia="Gulim"/>
-          <w:b w:val="0"/>
-          <w:i w:val="0"/>
-          <w:sz w:val="24"/>
-          <w:u w:val="none"/>
-        </w:rPr>
-        <w:t>: TS Foundation Models, Multimodal Learning, Knowledge Graph</w:t>
+        <w:ind w:left="850" w:hanging="255"/>
+      </w:pPr>
+      <w:r>
+        <w:rPr>
+          <w:rFonts w:ascii="Gulim" w:hAnsi="Gulim" w:eastAsia="Gulim"/>
+          <w:b w:val="0"/>
+          <w:i w:val="0"/>
+          <w:sz w:val="24"/>
+          <w:u w:val="none"/>
+        </w:rPr>
+        <w:t xml:space="preserve">o  </w:t>
+      </w:r>
+      <w:r>
+        <w:rPr>
+          <w:rFonts w:ascii="Gulim" w:hAnsi="Gulim" w:eastAsia="Gulim"/>
+          <w:b w:val="0"/>
+          <w:i w:val="0"/>
+          <w:sz w:val="24"/>
+          <w:u w:val="none"/>
+        </w:rPr>
+        <w:t>⑤ Supply Chain Knowledge Graph</w:t>
       </w:r>
     </w:p>
     <w:p>
@@ -3913,36 +3929,72 @@
           <w:sz w:val="24"/>
           <w:u w:val="none"/>
         </w:rPr>
-        <w:t>Programming Language</w:t>
-      </w:r>
-      <w:r>
-        <w:rPr>
-          <w:rFonts w:ascii="Gulim" w:hAnsi="Gulim" w:eastAsia="Gulim"/>
-          <w:b w:val="0"/>
-          <w:i w:val="0"/>
-          <w:sz w:val="24"/>
-          <w:u w:val="none"/>
-        </w:rPr>
-        <w:t>: Python</w:t>
+        <w:t>Key Algorithms</w:t>
+      </w:r>
+      <w:r>
+        <w:rPr>
+          <w:rFonts w:ascii="Gulim" w:hAnsi="Gulim" w:eastAsia="Gulim"/>
+          <w:b w:val="0"/>
+          <w:i w:val="0"/>
+          <w:sz w:val="24"/>
+          <w:u w:val="none"/>
+        </w:rPr>
+        <w:t>: TS Foundation Models, Multimodal Learning, LLM Agents, Knowledge Graph</w:t>
       </w:r>
     </w:p>
     <w:p>
       <w:pPr>
-        <w:spacing w:before="160" w:after="20"/>
-      </w:pPr>
+        <w:spacing w:before="0" w:after="0"/>
+        <w:ind w:left="425" w:hanging="255"/>
+      </w:pPr>
+      <w:r>
+        <w:rPr>
+          <w:rFonts w:ascii="Gulim" w:hAnsi="Gulim" w:eastAsia="Gulim"/>
+          <w:b w:val="0"/>
+          <w:i w:val="0"/>
+          <w:sz w:val="24"/>
+          <w:u w:val="none"/>
+        </w:rPr>
+        <w:t xml:space="preserve">• </w:t>
+      </w:r>
       <w:r>
         <w:rPr>
           <w:rFonts w:ascii="Gulim" w:hAnsi="Gulim" w:eastAsia="Gulim"/>
           <w:b/>
           <w:i w:val="0"/>
-          <w:sz w:val="25"/>
-          <w:u w:val="none"/>
-        </w:rPr>
-        <w:t>2. KRAFTON</w:t>
+          <w:sz w:val="24"/>
+          <w:u w:val="none"/>
+        </w:rPr>
+        <w:t>Programming Language</w:t>
+      </w:r>
+      <w:r>
+        <w:rPr>
+          <w:rFonts w:ascii="Gulim" w:hAnsi="Gulim" w:eastAsia="Gulim"/>
+          <w:b w:val="0"/>
+          <w:i w:val="0"/>
+          <w:sz w:val="24"/>
+          <w:u w:val="none"/>
+        </w:rPr>
+        <w:t>: Python</w:t>
       </w:r>
     </w:p>
     <w:p>
       <w:pPr>
+        <w:spacing w:before="0" w:after="20"/>
+      </w:pPr>
+      <w:r>
+        <w:rPr>
+          <w:rFonts w:ascii="Gulim" w:hAnsi="Gulim" w:eastAsia="Gulim"/>
+          <w:b/>
+          <w:i w:val="0"/>
+          <w:sz w:val="25"/>
+          <w:u w:val="none"/>
+        </w:rPr>
+        <w:t>2. KRAFTON</w:t>
+      </w:r>
+    </w:p>
+    <w:p>
+      <w:pPr>
         <w:spacing w:before="0" w:after="0"/>
         <w:ind w:left="425" w:hanging="255"/>
       </w:pPr>
@@ -4211,7 +4263,7 @@
     </w:p>
     <w:p>
       <w:pPr>
-        <w:spacing w:before="160" w:after="20"/>
+        <w:spacing w:before="0" w:after="20"/>
       </w:pPr>
       <w:r>
         <w:rPr>
@@ -4484,7 +4536,7 @@
     </w:p>
     <w:p>
       <w:pPr>
-        <w:spacing w:before="160" w:after="20"/>
+        <w:spacing w:before="0" w:after="20"/>
       </w:pPr>
       <w:r>
         <w:rPr>
@@ -4757,7 +4809,7 @@
     </w:p>
     <w:p>
       <w:pPr>
-        <w:spacing w:before="160" w:after="20"/>
+        <w:spacing w:before="0" w:after="20"/>
       </w:pPr>
       <w:r>
         <w:rPr>

</xml_diff>

<commit_message>
CV: fix cover layout, keep entries from splitting across pages, shorter link labels
</commit_message>
<xml_diff>
--- a/SeunghanLee_CV.docx
+++ b/SeunghanLee_CV.docx
@@ -17,13 +17,13 @@
         </w:tblBorders>
       </w:tblPr>
       <w:tblGrid>
-        <w:gridCol w:w="2381"/>
-        <w:gridCol w:w="7313"/>
+        <w:gridCol w:w="2551"/>
+        <w:gridCol w:w="7200"/>
       </w:tblGrid>
       <w:tr>
         <w:tc>
           <w:tcPr>
-            <w:tcW w:type="dxa" w:w="2381"/>
+            <w:tcW w:type="dxa" w:w="2551"/>
           </w:tcPr>
           <w:p>
             <w:pPr>
@@ -67,7 +67,7 @@
         </w:tc>
         <w:tc>
           <w:tcPr>
-            <w:tcW w:type="dxa" w:w="7313"/>
+            <w:tcW w:type="dxa" w:w="7200"/>
           </w:tcPr>
           <w:p>
             <w:pPr>
@@ -88,7 +88,7 @@
           <w:p>
             <w:pPr>
               <w:spacing w:before="0" w:after="0"/>
-              <w:ind w:left="0" w:hanging="360"/>
+              <w:ind w:left="340" w:hanging="340"/>
             </w:pPr>
             <w:r>
               <w:rPr>
@@ -115,7 +115,7 @@
           <w:p>
             <w:pPr>
               <w:spacing w:before="0" w:after="0"/>
-              <w:ind w:left="0" w:hanging="360"/>
+              <w:ind w:left="340" w:hanging="340"/>
             </w:pPr>
             <w:r>
               <w:rPr>
@@ -142,7 +142,7 @@
           <w:p>
             <w:pPr>
               <w:spacing w:before="0" w:after="0"/>
-              <w:ind w:left="0" w:hanging="360"/>
+              <w:ind w:left="340" w:hanging="340"/>
             </w:pPr>
             <w:r>
               <w:rPr>
@@ -169,7 +169,7 @@
           <w:p>
             <w:pPr>
               <w:spacing w:before="0" w:after="0"/>
-              <w:ind w:left="0" w:hanging="360"/>
+              <w:ind w:left="340" w:hanging="340"/>
             </w:pPr>
             <w:r>
               <w:rPr>
@@ -196,7 +196,7 @@
           <w:p>
             <w:pPr>
               <w:spacing w:before="0" w:after="0"/>
-              <w:ind w:left="720" w:hanging="360"/>
+              <w:ind w:left="964" w:hanging="340"/>
             </w:pPr>
             <w:r>
               <w:rPr>
@@ -236,7 +236,7 @@
           <w:p>
             <w:pPr>
               <w:spacing w:before="0" w:after="0"/>
-              <w:ind w:left="720" w:hanging="360"/>
+              <w:ind w:left="964" w:hanging="340"/>
             </w:pPr>
             <w:r>
               <w:rPr>
@@ -269,14 +269,14 @@
                   <w:sz w:val="20"/>
                   <w:u w:val="single"/>
                 </w:rPr>
-                <w:t>https://www.linkedin.com/in/seunghan-lee-0bba49169/</w:t>
+                <w:t>linkedin.com/in/seunghan-lee-0bba49169</w:t>
               </w:r>
             </w:hyperlink>
           </w:p>
           <w:p>
             <w:pPr>
               <w:spacing w:before="0" w:after="0"/>
-              <w:ind w:left="720" w:hanging="360"/>
+              <w:ind w:left="964" w:hanging="340"/>
             </w:pPr>
             <w:r>
               <w:rPr>
@@ -309,14 +309,14 @@
                   <w:sz w:val="20"/>
                   <w:u w:val="single"/>
                 </w:rPr>
-                <w:t>https://seunghan96.github.io/seunghanlee/</w:t>
+                <w:t>seunghan96.github.io/seunghanlee</w:t>
               </w:r>
             </w:hyperlink>
           </w:p>
           <w:p>
             <w:pPr>
               <w:spacing w:before="0" w:after="0"/>
-              <w:ind w:left="720" w:hanging="360"/>
+              <w:ind w:left="964" w:hanging="340"/>
             </w:pPr>
             <w:r>
               <w:rPr>
@@ -349,7 +349,7 @@
                   <w:sz w:val="20"/>
                   <w:u w:val="single"/>
                 </w:rPr>
-                <w:t>https://seunghan96.github.io/</w:t>
+                <w:t>seunghan96.github.io</w:t>
               </w:r>
             </w:hyperlink>
             <w:r>
@@ -1526,7 +1526,10 @@
     </w:p>
     <w:p>
       <w:pPr>
-        <w:spacing w:before="0" w:after="160"/>
+        <w:pBdr>
+          <w:bottom w:val="single" w:sz="12" w:space="1" w:color="000000"/>
+        </w:pBdr>
+        <w:spacing w:before="0" w:after="40" w:line="240" w:lineRule="auto"/>
       </w:pPr>
       <w:r>
         <w:rPr>
@@ -1536,13 +1539,19 @@
           <w:sz w:val="34"/>
           <w:u w:val="none"/>
         </w:rPr>
-        <w:t xml:space="preserve">3. Publications </w:t>
-      </w:r>
-      <w:r>
-        <w:rPr>
-          <w:rFonts w:ascii="Gulim" w:hAnsi="Gulim" w:eastAsia="Gulim"/>
-          <w:b w:val="0"/>
-          <w:i w:val="0"/>
+        <w:t>3. Publications</w:t>
+      </w:r>
+    </w:p>
+    <w:p>
+      <w:pPr>
+        <w:spacing w:before="0" w:after="120"/>
+      </w:pPr>
+      <w:r>
+        <w:rPr>
+          <w:rFonts w:ascii="Gulim" w:hAnsi="Gulim" w:eastAsia="Gulim"/>
+          <w:b w:val="0"/>
+          <w:i w:val="0"/>
+          <w:sz w:val="21"/>
           <w:u w:val="none"/>
         </w:rPr>
         <w:t>(</w:t>
@@ -1554,6 +1563,7 @@
           <w:i w:val="0"/>
           <w:sz w:val="16"/>
           <w:u w:val="none"/>
+          <w:vertAlign w:val="superscript"/>
         </w:rPr>
         <w:t>*</w:t>
       </w:r>
@@ -1562,6 +1572,7 @@
           <w:rFonts w:ascii="Gulim" w:hAnsi="Gulim" w:eastAsia="Gulim"/>
           <w:b w:val="0"/>
           <w:i w:val="0"/>
+          <w:sz w:val="21"/>
           <w:u w:val="none"/>
         </w:rPr>
         <w:t xml:space="preserve">Equally Contributed, </w:t>
@@ -1573,6 +1584,7 @@
           <w:i w:val="0"/>
           <w:sz w:val="16"/>
           <w:u w:val="none"/>
+          <w:vertAlign w:val="superscript"/>
         </w:rPr>
         <w:t>†</w:t>
       </w:r>
@@ -1581,9 +1593,10 @@
           <w:rFonts w:ascii="Gulim" w:hAnsi="Gulim" w:eastAsia="Gulim"/>
           <w:b w:val="0"/>
           <w:i w:val="0"/>
-          <w:u w:val="none"/>
-        </w:rPr>
-        <w:t>Co-corresponding Authors, )</w:t>
+          <w:sz w:val="21"/>
+          <w:u w:val="none"/>
+        </w:rPr>
+        <w:t>Co-corresponding Authors)</w:t>
       </w:r>
     </w:p>
     <w:p>
@@ -2513,8 +2526,9 @@
           <w:rFonts w:ascii="Gulim" w:hAnsi="Gulim" w:eastAsia="Gulim"/>
           <w:b w:val="0"/>
           <w:i w:val="0"/>
-          <w:sz w:val="14"/>
-          <w:u w:val="none"/>
+          <w:sz w:val="15"/>
+          <w:u w:val="none"/>
+          <w:vertAlign w:val="superscript"/>
         </w:rPr>
         <w:t>†</w:t>
       </w:r>
@@ -2533,8 +2547,9 @@
           <w:rFonts w:ascii="Gulim" w:hAnsi="Gulim" w:eastAsia="Gulim"/>
           <w:b w:val="0"/>
           <w:i w:val="0"/>
-          <w:sz w:val="14"/>
-          <w:u w:val="none"/>
+          <w:sz w:val="15"/>
+          <w:u w:val="none"/>
+          <w:vertAlign w:val="superscript"/>
         </w:rPr>
         <w:t>†</w:t>
       </w:r>
@@ -2634,8 +2649,9 @@
           <w:rFonts w:ascii="Gulim" w:hAnsi="Gulim" w:eastAsia="Gulim"/>
           <w:b w:val="0"/>
           <w:i w:val="0"/>
-          <w:sz w:val="14"/>
-          <w:u w:val="none"/>
+          <w:sz w:val="15"/>
+          <w:u w:val="none"/>
+          <w:vertAlign w:val="superscript"/>
         </w:rPr>
         <w:t>*</w:t>
       </w:r>
@@ -2654,8 +2670,9 @@
           <w:rFonts w:ascii="Gulim" w:hAnsi="Gulim" w:eastAsia="Gulim"/>
           <w:b w:val="0"/>
           <w:i w:val="0"/>
-          <w:sz w:val="14"/>
-          <w:u w:val="none"/>
+          <w:sz w:val="15"/>
+          <w:u w:val="none"/>
+          <w:vertAlign w:val="superscript"/>
         </w:rPr>
         <w:t>*</w:t>
       </w:r>
@@ -2674,8 +2691,9 @@
           <w:rFonts w:ascii="Gulim" w:hAnsi="Gulim" w:eastAsia="Gulim"/>
           <w:b w:val="0"/>
           <w:i w:val="0"/>
-          <w:sz w:val="14"/>
-          <w:u w:val="none"/>
+          <w:sz w:val="15"/>
+          <w:u w:val="none"/>
+          <w:vertAlign w:val="superscript"/>
         </w:rPr>
         <w:t>†</w:t>
       </w:r>
@@ -2694,8 +2712,9 @@
           <w:rFonts w:ascii="Gulim" w:hAnsi="Gulim" w:eastAsia="Gulim"/>
           <w:b w:val="0"/>
           <w:i w:val="0"/>
-          <w:sz w:val="14"/>
-          <w:u w:val="none"/>
+          <w:sz w:val="15"/>
+          <w:u w:val="none"/>
+          <w:vertAlign w:val="superscript"/>
         </w:rPr>
         <w:t>†</w:t>
       </w:r>
@@ -2805,8 +2824,9 @@
           <w:rFonts w:ascii="Gulim" w:hAnsi="Gulim" w:eastAsia="Gulim"/>
           <w:b w:val="0"/>
           <w:i w:val="0"/>
-          <w:sz w:val="14"/>
-          <w:u w:val="none"/>
+          <w:sz w:val="15"/>
+          <w:u w:val="none"/>
+          <w:vertAlign w:val="superscript"/>
         </w:rPr>
         <w:t>†</w:t>
       </w:r>
@@ -2825,8 +2845,9 @@
           <w:rFonts w:ascii="Gulim" w:hAnsi="Gulim" w:eastAsia="Gulim"/>
           <w:b w:val="0"/>
           <w:i w:val="0"/>
-          <w:sz w:val="14"/>
-          <w:u w:val="none"/>
+          <w:sz w:val="15"/>
+          <w:u w:val="none"/>
+          <w:vertAlign w:val="superscript"/>
         </w:rPr>
         <w:t>†</w:t>
       </w:r>
@@ -2958,8 +2979,9 @@
           <w:rFonts w:ascii="Gulim" w:hAnsi="Gulim" w:eastAsia="Gulim"/>
           <w:b w:val="0"/>
           <w:i w:val="0"/>
-          <w:sz w:val="14"/>
-          <w:u w:val="none"/>
+          <w:sz w:val="15"/>
+          <w:u w:val="none"/>
+          <w:vertAlign w:val="superscript"/>
         </w:rPr>
         <w:t>†</w:t>
       </w:r>
@@ -2978,8 +3000,9 @@
           <w:rFonts w:ascii="Gulim" w:hAnsi="Gulim" w:eastAsia="Gulim"/>
           <w:b w:val="0"/>
           <w:i w:val="0"/>
-          <w:sz w:val="14"/>
-          <w:u w:val="none"/>
+          <w:sz w:val="15"/>
+          <w:u w:val="none"/>
+          <w:vertAlign w:val="superscript"/>
         </w:rPr>
         <w:t>†</w:t>
       </w:r>
@@ -3469,8 +3492,9 @@
           <w:rFonts w:ascii="Gulim" w:hAnsi="Gulim" w:eastAsia="Gulim"/>
           <w:b w:val="0"/>
           <w:i w:val="0"/>
-          <w:sz w:val="14"/>
-          <w:u w:val="none"/>
+          <w:sz w:val="15"/>
+          <w:u w:val="none"/>
+          <w:vertAlign w:val="superscript"/>
         </w:rPr>
         <w:t>*</w:t>
       </w:r>
@@ -3489,8 +3513,9 @@
           <w:rFonts w:ascii="Gulim" w:hAnsi="Gulim" w:eastAsia="Gulim"/>
           <w:b w:val="0"/>
           <w:i w:val="0"/>
-          <w:sz w:val="14"/>
-          <w:u w:val="none"/>
+          <w:sz w:val="15"/>
+          <w:u w:val="none"/>
+          <w:vertAlign w:val="superscript"/>
         </w:rPr>
         <w:t>*</w:t>
       </w:r>

</xml_diff>

<commit_message>
CV: add the four new 2026 papers and keep the build toolkit in-tree
Publications 18-21: When Summaries Distort Decisions (EMNLP 2026) and the
FinVerse / ReasonCast / Beyond Magnitude preprints. FinSTaR moves to
EMNLP 2026 with the KDD workshop as its preliminary version. Still 12 pages.

The scripts that produced the PDF only ever lived in a /tmp scratchpad, so
they are now committed under cv_build/ with the fonts and a README. One fix
was needed: the leading floor used max(base, MARK_PT / S), which inflated
line boxes for the banner theme (scale 0.85) and grew the CV to 14 pages;
max(base, MARK_PT) reproduces the shipped layout pixel for pixel.
</commit_message>
<xml_diff>
--- a/SeunghanLee_CV.docx
+++ b/SeunghanLee_CV.docx
@@ -1659,7 +1659,7 @@
           <w:sz w:val="21"/>
           <w:u w:val="none"/>
         </w:rPr>
-        <w:t>17. AdaTKG: Adaptive Memory for Temporal Knowledge Graph Reasoning (2026)</w:t>
+        <w:t>21. FinVerse: Financial Time-Series Benchmark (2026)</w:t>
       </w:r>
     </w:p>
     <w:p>
@@ -1674,7 +1674,7 @@
           <w:sz w:val="19"/>
           <w:u w:val="none"/>
         </w:rPr>
-        <w:t xml:space="preserve">- </w:t>
+        <w:t xml:space="preserve">- Jaehoon Lee, Jun Seo, </w:t>
       </w:r>
       <w:r>
         <w:rPr>
@@ -1694,7 +1694,7 @@
           <w:sz w:val="19"/>
           <w:u w:val="none"/>
         </w:rPr>
-        <w:t>, Jun Seo, Jaehoon Lee, Sungdong Yoo, Minjae Kim, Tae Yoon Lim, Dongwan Kang, Hwanil Choi, SoonYoung Lee, Wonbin Ahn</w:t>
+        <w:t>, Tae Yoon Lim, Dongwan Kang, Hwanil Choi, Minjae Kim, Sungdong Yoo, Junhyeok Kang, Sangjun Han, Soonyoung Lee, Wonbin Ahn</w:t>
       </w:r>
     </w:p>
     <w:p>
@@ -1720,19 +1720,21 @@
           <w:sz w:val="19"/>
           <w:u w:val="none"/>
         </w:rPr>
-        <w:t xml:space="preserve">KDDW (GMLLM), 2026. </w:t>
-      </w:r>
-      <w:r>
-        <w:rPr>
-          <w:rFonts w:ascii="Lato" w:hAnsi="Lato" w:eastAsia="Lato" w:cs="Lato"/>
-          <w:b w:val="0"/>
-          <w:i w:val="0"/>
-          <w:color w:val="C4761A"/>
-          <w:sz w:val="19"/>
-          <w:u w:val="none"/>
-        </w:rPr>
-        <w:t xml:space="preserve">Oral </w:t>
-      </w:r>
+        <w:t>arXiv preprint, 2026. [</w:t>
+      </w:r>
+      <w:hyperlink r:id="rId16">
+        <w:r>
+          <w:rPr>
+            <w:rFonts w:ascii="Lato" w:hAnsi="Lato" w:eastAsia="Lato" w:cs="Lato"/>
+            <w:b w:val="0"/>
+            <w:i w:val="0"/>
+            <w:color w:val="0F3D57"/>
+            <w:sz w:val="19"/>
+            <w:u w:val="single"/>
+          </w:rPr>
+          <w:t>arxiv:2608.03259</w:t>
+        </w:r>
+      </w:hyperlink>
       <w:r>
         <w:rPr>
           <w:rFonts w:ascii="Lato" w:hAnsi="Lato" w:eastAsia="Lato" w:cs="Lato"/>
@@ -1742,9 +1744,411 @@
           <w:sz w:val="19"/>
           <w:u w:val="none"/>
         </w:rPr>
+        <w:t>]</w:t>
+      </w:r>
+    </w:p>
+    <w:p>
+      <w:pPr>
+        <w:spacing w:before="176" w:after="20"/>
+      </w:pPr>
+      <w:r>
+        <w:rPr>
+          <w:rFonts w:ascii="Lato" w:hAnsi="Lato" w:eastAsia="Lato" w:cs="Lato"/>
+          <w:b/>
+          <w:i w:val="0"/>
+          <w:color w:val="0F3D57"/>
+          <w:sz w:val="21"/>
+          <w:u w:val="none"/>
+        </w:rPr>
+        <w:t>20. ReasonCast: Towards Explainable Time Series Forecasting with Reasoning (2026)</w:t>
+      </w:r>
+    </w:p>
+    <w:p>
+      <w:pPr>
+        <w:spacing w:before="0" w:after="0"/>
+      </w:pPr>
+      <w:r>
+        <w:rPr>
+          <w:rFonts w:ascii="Lato" w:hAnsi="Lato" w:eastAsia="Lato" w:cs="Lato"/>
+          <w:b w:val="0"/>
+          <w:i w:val="0"/>
+          <w:sz w:val="19"/>
+          <w:u w:val="none"/>
+        </w:rPr>
+        <w:t xml:space="preserve">- </w:t>
+      </w:r>
+      <w:r>
+        <w:rPr>
+          <w:rFonts w:ascii="Lato" w:hAnsi="Lato" w:eastAsia="Lato" w:cs="Lato"/>
+          <w:b/>
+          <w:i w:val="0"/>
+          <w:sz w:val="19"/>
+          <w:u w:val="none"/>
+        </w:rPr>
+        <w:t>Seunghan Lee</w:t>
+      </w:r>
+      <w:r>
+        <w:rPr>
+          <w:rFonts w:ascii="Lato" w:hAnsi="Lato" w:eastAsia="Lato" w:cs="Lato"/>
+          <w:b w:val="0"/>
+          <w:i w:val="0"/>
+          <w:sz w:val="19"/>
+          <w:u w:val="none"/>
+        </w:rPr>
+        <w:t>, Jun Seo, Jaehoon Lee, Junhyeok Kang, Sangjun Han, Sungdong Yoo, Minjae Kim, Tae Yoon Lim, Dongwan Kang, Hwanil Choi, Soonyoung Lee, Wonbin Ahn</w:t>
+      </w:r>
+    </w:p>
+    <w:p>
+      <w:pPr>
+        <w:spacing w:before="0" w:after="0"/>
+      </w:pPr>
+      <w:r>
+        <w:rPr>
+          <w:rFonts w:ascii="Lato" w:hAnsi="Lato" w:eastAsia="Lato" w:cs="Lato"/>
+          <w:b w:val="0"/>
+          <w:i w:val="0"/>
+          <w:sz w:val="19"/>
+          <w:u w:val="none"/>
+        </w:rPr>
+        <w:t xml:space="preserve">- In </w:t>
+      </w:r>
+      <w:r>
+        <w:rPr>
+          <w:rFonts w:ascii="Lato" w:hAnsi="Lato" w:eastAsia="Lato" w:cs="Lato"/>
+          <w:b w:val="0"/>
+          <w:i/>
+          <w:color w:val="4A4A4A"/>
+          <w:sz w:val="19"/>
+          <w:u w:val="none"/>
+        </w:rPr>
+        <w:t>arXiv preprint, 2026. [</w:t>
+      </w:r>
+      <w:hyperlink r:id="rId17">
+        <w:r>
+          <w:rPr>
+            <w:rFonts w:ascii="Lato" w:hAnsi="Lato" w:eastAsia="Lato" w:cs="Lato"/>
+            <w:b w:val="0"/>
+            <w:i w:val="0"/>
+            <w:color w:val="0F3D57"/>
+            <w:sz w:val="19"/>
+            <w:u w:val="single"/>
+          </w:rPr>
+          <w:t>arxiv:2608.01875</w:t>
+        </w:r>
+      </w:hyperlink>
+      <w:r>
+        <w:rPr>
+          <w:rFonts w:ascii="Lato" w:hAnsi="Lato" w:eastAsia="Lato" w:cs="Lato"/>
+          <w:b w:val="0"/>
+          <w:i/>
+          <w:color w:val="4A4A4A"/>
+          <w:sz w:val="19"/>
+          <w:u w:val="none"/>
+        </w:rPr>
+        <w:t>]</w:t>
+      </w:r>
+    </w:p>
+    <w:p>
+      <w:pPr>
+        <w:spacing w:before="176" w:after="20"/>
+      </w:pPr>
+      <w:r>
+        <w:rPr>
+          <w:rFonts w:ascii="Lato" w:hAnsi="Lato" w:eastAsia="Lato" w:cs="Lato"/>
+          <w:b/>
+          <w:i w:val="0"/>
+          <w:color w:val="0F3D57"/>
+          <w:sz w:val="21"/>
+          <w:u w:val="none"/>
+        </w:rPr>
+        <w:t>19. Beyond Magnitude and Shape: A Direction-Aware Loss for Time Series Forecasting (2026)</w:t>
+      </w:r>
+    </w:p>
+    <w:p>
+      <w:pPr>
+        <w:spacing w:before="0" w:after="0"/>
+      </w:pPr>
+      <w:r>
+        <w:rPr>
+          <w:rFonts w:ascii="Lato" w:hAnsi="Lato" w:eastAsia="Lato" w:cs="Lato"/>
+          <w:b w:val="0"/>
+          <w:i w:val="0"/>
+          <w:sz w:val="19"/>
+          <w:u w:val="none"/>
+        </w:rPr>
+        <w:t xml:space="preserve">- </w:t>
+      </w:r>
+      <w:r>
+        <w:rPr>
+          <w:rFonts w:ascii="Lato" w:hAnsi="Lato" w:eastAsia="Lato" w:cs="Lato"/>
+          <w:b/>
+          <w:i w:val="0"/>
+          <w:sz w:val="19"/>
+          <w:u w:val="none"/>
+        </w:rPr>
+        <w:t>Seunghan Lee</w:t>
+      </w:r>
+      <w:r>
+        <w:rPr>
+          <w:rFonts w:ascii="Lato" w:hAnsi="Lato" w:eastAsia="Lato" w:cs="Lato"/>
+          <w:b w:val="0"/>
+          <w:i w:val="0"/>
+          <w:sz w:val="19"/>
+          <w:u w:val="none"/>
+        </w:rPr>
+        <w:t>, Jaehoon Lee, Jun Seo, Junhyeok Kang, Sangjun Han, Sungdong Yoo, Minjae Kim, Tae Yoon Lim, Dongwan Kang, Hwanil Choi, Soonyoung Lee, Wonbin Ahn</w:t>
+      </w:r>
+    </w:p>
+    <w:p>
+      <w:pPr>
+        <w:spacing w:before="0" w:after="0"/>
+      </w:pPr>
+      <w:r>
+        <w:rPr>
+          <w:rFonts w:ascii="Lato" w:hAnsi="Lato" w:eastAsia="Lato" w:cs="Lato"/>
+          <w:b w:val="0"/>
+          <w:i w:val="0"/>
+          <w:sz w:val="19"/>
+          <w:u w:val="none"/>
+        </w:rPr>
+        <w:t xml:space="preserve">- In </w:t>
+      </w:r>
+      <w:r>
+        <w:rPr>
+          <w:rFonts w:ascii="Lato" w:hAnsi="Lato" w:eastAsia="Lato" w:cs="Lato"/>
+          <w:b w:val="0"/>
+          <w:i/>
+          <w:color w:val="4A4A4A"/>
+          <w:sz w:val="19"/>
+          <w:u w:val="none"/>
+        </w:rPr>
+        <w:t>arXiv preprint, 2026. [</w:t>
+      </w:r>
+      <w:hyperlink r:id="rId18">
+        <w:r>
+          <w:rPr>
+            <w:rFonts w:ascii="Lato" w:hAnsi="Lato" w:eastAsia="Lato" w:cs="Lato"/>
+            <w:b w:val="0"/>
+            <w:i w:val="0"/>
+            <w:color w:val="0F3D57"/>
+            <w:sz w:val="19"/>
+            <w:u w:val="single"/>
+          </w:rPr>
+          <w:t>arxiv:2608.01857</w:t>
+        </w:r>
+      </w:hyperlink>
+      <w:r>
+        <w:rPr>
+          <w:rFonts w:ascii="Lato" w:hAnsi="Lato" w:eastAsia="Lato" w:cs="Lato"/>
+          <w:b w:val="0"/>
+          <w:i/>
+          <w:color w:val="4A4A4A"/>
+          <w:sz w:val="19"/>
+          <w:u w:val="none"/>
+        </w:rPr>
+        <w:t>]</w:t>
+      </w:r>
+    </w:p>
+    <w:p>
+      <w:pPr>
+        <w:spacing w:before="176" w:after="20"/>
+      </w:pPr>
+      <w:r>
+        <w:rPr>
+          <w:rFonts w:ascii="Lato" w:hAnsi="Lato" w:eastAsia="Lato" w:cs="Lato"/>
+          <w:b/>
+          <w:i w:val="0"/>
+          <w:color w:val="0F3D57"/>
+          <w:sz w:val="21"/>
+          <w:u w:val="none"/>
+        </w:rPr>
+        <w:t>18. When Summaries Distort Decisions: Information Fidelity in LLM-Compressed Financial Analysis (2026)</w:t>
+      </w:r>
+    </w:p>
+    <w:p>
+      <w:pPr>
+        <w:spacing w:before="0" w:after="0"/>
+      </w:pPr>
+      <w:r>
+        <w:rPr>
+          <w:rFonts w:ascii="Lato" w:hAnsi="Lato" w:eastAsia="Lato" w:cs="Lato"/>
+          <w:b w:val="0"/>
+          <w:i w:val="0"/>
+          <w:sz w:val="19"/>
+          <w:u w:val="none"/>
+        </w:rPr>
+        <w:t xml:space="preserve">- Hoyoung Lee, Suhwan Park, </w:t>
+      </w:r>
+      <w:r>
+        <w:rPr>
+          <w:rFonts w:ascii="Lato" w:hAnsi="Lato" w:eastAsia="Lato" w:cs="Lato"/>
+          <w:b/>
+          <w:i w:val="0"/>
+          <w:sz w:val="19"/>
+          <w:u w:val="none"/>
+        </w:rPr>
+        <w:t>Seunghan Lee</w:t>
+      </w:r>
+      <w:r>
+        <w:rPr>
+          <w:rFonts w:ascii="Lato" w:hAnsi="Lato" w:eastAsia="Lato" w:cs="Lato"/>
+          <w:b w:val="0"/>
+          <w:i w:val="0"/>
+          <w:sz w:val="19"/>
+          <w:u w:val="none"/>
+        </w:rPr>
+        <w:t>, Jun Seo, Jaehoon Lee, Sungdong Yoo, Minjae Kim, CheolWon Na, Zhangyang Wang, Zach Golkhou, Minkyu Kim, Sotirios Sabanis, Alejandro Lopez-Lira, Dhagash Mehta, Soonyoung Lee, Chanyeol Choi, Wonbin Ahn, Yongjae Lee</w:t>
+      </w:r>
+    </w:p>
+    <w:p>
+      <w:pPr>
+        <w:spacing w:before="0" w:after="0"/>
+      </w:pPr>
+      <w:r>
+        <w:rPr>
+          <w:rFonts w:ascii="Lato" w:hAnsi="Lato" w:eastAsia="Lato" w:cs="Lato"/>
+          <w:b w:val="0"/>
+          <w:i w:val="0"/>
+          <w:sz w:val="19"/>
+          <w:u w:val="none"/>
+        </w:rPr>
+        <w:t xml:space="preserve">- In </w:t>
+      </w:r>
+      <w:r>
+        <w:rPr>
+          <w:rFonts w:ascii="Lato" w:hAnsi="Lato" w:eastAsia="Lato" w:cs="Lato"/>
+          <w:b w:val="0"/>
+          <w:i/>
+          <w:color w:val="4A4A4A"/>
+          <w:sz w:val="19"/>
+          <w:u w:val="none"/>
+        </w:rPr>
+        <w:t>EMNLP, 2026. [</w:t>
+      </w:r>
+      <w:hyperlink r:id="rId19">
+        <w:r>
+          <w:rPr>
+            <w:rFonts w:ascii="Lato" w:hAnsi="Lato" w:eastAsia="Lato" w:cs="Lato"/>
+            <w:b w:val="0"/>
+            <w:i w:val="0"/>
+            <w:color w:val="0F3D57"/>
+            <w:sz w:val="19"/>
+            <w:u w:val="single"/>
+          </w:rPr>
+          <w:t>arxiv:2606.29251</w:t>
+        </w:r>
+      </w:hyperlink>
+      <w:r>
+        <w:rPr>
+          <w:rFonts w:ascii="Lato" w:hAnsi="Lato" w:eastAsia="Lato" w:cs="Lato"/>
+          <w:b w:val="0"/>
+          <w:i/>
+          <w:color w:val="4A4A4A"/>
+          <w:sz w:val="19"/>
+          <w:u w:val="none"/>
+        </w:rPr>
+        <w:t>]</w:t>
+      </w:r>
+    </w:p>
+    <w:p>
+      <w:pPr>
+        <w:spacing w:before="176" w:after="20"/>
+      </w:pPr>
+      <w:r>
+        <w:rPr>
+          <w:rFonts w:ascii="Lato" w:hAnsi="Lato" w:eastAsia="Lato" w:cs="Lato"/>
+          <w:b/>
+          <w:i w:val="0"/>
+          <w:color w:val="0F3D57"/>
+          <w:sz w:val="21"/>
+          <w:u w:val="none"/>
+        </w:rPr>
+        <w:t>17. AdaTKG: Adaptive Memory for Temporal Knowledge Graph Reasoning (2026)</w:t>
+      </w:r>
+    </w:p>
+    <w:p>
+      <w:pPr>
+        <w:spacing w:before="0" w:after="0"/>
+      </w:pPr>
+      <w:r>
+        <w:rPr>
+          <w:rFonts w:ascii="Lato" w:hAnsi="Lato" w:eastAsia="Lato" w:cs="Lato"/>
+          <w:b w:val="0"/>
+          <w:i w:val="0"/>
+          <w:sz w:val="19"/>
+          <w:u w:val="none"/>
+        </w:rPr>
+        <w:t xml:space="preserve">- </w:t>
+      </w:r>
+      <w:r>
+        <w:rPr>
+          <w:rFonts w:ascii="Lato" w:hAnsi="Lato" w:eastAsia="Lato" w:cs="Lato"/>
+          <w:b/>
+          <w:i w:val="0"/>
+          <w:sz w:val="19"/>
+          <w:u w:val="none"/>
+        </w:rPr>
+        <w:t>Seunghan Lee</w:t>
+      </w:r>
+      <w:r>
+        <w:rPr>
+          <w:rFonts w:ascii="Lato" w:hAnsi="Lato" w:eastAsia="Lato" w:cs="Lato"/>
+          <w:b w:val="0"/>
+          <w:i w:val="0"/>
+          <w:sz w:val="19"/>
+          <w:u w:val="none"/>
+        </w:rPr>
+        <w:t>, Jun Seo, Jaehoon Lee, Sungdong Yoo, Minjae Kim, Tae Yoon Lim, Dongwan Kang, Hwanil Choi, SoonYoung Lee, Wonbin Ahn</w:t>
+      </w:r>
+    </w:p>
+    <w:p>
+      <w:pPr>
+        <w:spacing w:before="0" w:after="0"/>
+      </w:pPr>
+      <w:r>
+        <w:rPr>
+          <w:rFonts w:ascii="Lato" w:hAnsi="Lato" w:eastAsia="Lato" w:cs="Lato"/>
+          <w:b w:val="0"/>
+          <w:i w:val="0"/>
+          <w:sz w:val="19"/>
+          <w:u w:val="none"/>
+        </w:rPr>
+        <w:t xml:space="preserve">- In </w:t>
+      </w:r>
+      <w:r>
+        <w:rPr>
+          <w:rFonts w:ascii="Lato" w:hAnsi="Lato" w:eastAsia="Lato" w:cs="Lato"/>
+          <w:b w:val="0"/>
+          <w:i/>
+          <w:color w:val="4A4A4A"/>
+          <w:sz w:val="19"/>
+          <w:u w:val="none"/>
+        </w:rPr>
+        <w:t xml:space="preserve">KDDW (GMLLM), 2026. </w:t>
+      </w:r>
+      <w:r>
+        <w:rPr>
+          <w:rFonts w:ascii="Lato" w:hAnsi="Lato" w:eastAsia="Lato" w:cs="Lato"/>
+          <w:b w:val="0"/>
+          <w:i w:val="0"/>
+          <w:color w:val="C4761A"/>
+          <w:sz w:val="19"/>
+          <w:u w:val="none"/>
+        </w:rPr>
+        <w:t xml:space="preserve">Oral </w:t>
+      </w:r>
+      <w:r>
+        <w:rPr>
+          <w:rFonts w:ascii="Lato" w:hAnsi="Lato" w:eastAsia="Lato" w:cs="Lato"/>
+          <w:b w:val="0"/>
+          <w:i/>
+          <w:color w:val="4A4A4A"/>
+          <w:sz w:val="19"/>
+          <w:u w:val="none"/>
+        </w:rPr>
         <w:t>[</w:t>
       </w:r>
-      <w:hyperlink r:id="rId16">
+      <w:hyperlink r:id="rId20">
         <w:r>
           <w:rPr>
             <w:rFonts w:ascii="Lato" w:hAnsi="Lato" w:eastAsia="Lato" w:cs="Lato"/>
@@ -1843,31 +2247,9 @@
           <w:sz w:val="19"/>
           <w:u w:val="none"/>
         </w:rPr>
-        <w:t xml:space="preserve">KDDW, 2026. </w:t>
-      </w:r>
-      <w:r>
-        <w:rPr>
-          <w:rFonts w:ascii="Lato" w:hAnsi="Lato" w:eastAsia="Lato" w:cs="Lato"/>
-          <w:b w:val="0"/>
-          <w:i w:val="0"/>
-          <w:color w:val="C4761A"/>
-          <w:sz w:val="19"/>
-          <w:u w:val="none"/>
-        </w:rPr>
-        <w:t xml:space="preserve">Oral </w:t>
-      </w:r>
-      <w:r>
-        <w:rPr>
-          <w:rFonts w:ascii="Lato" w:hAnsi="Lato" w:eastAsia="Lato" w:cs="Lato"/>
-          <w:b w:val="0"/>
-          <w:i/>
-          <w:color w:val="4A4A4A"/>
-          <w:sz w:val="19"/>
-          <w:u w:val="none"/>
-        </w:rPr>
-        <w:t>[</w:t>
-      </w:r>
-      <w:hyperlink r:id="rId17">
+        <w:t>EMNLP, 2026. [</w:t>
+      </w:r>
+      <w:hyperlink r:id="rId21">
         <w:r>
           <w:rPr>
             <w:rFonts w:ascii="Lato" w:hAnsi="Lato" w:eastAsia="Lato" w:cs="Lato"/>
@@ -1894,69 +2276,8 @@
     </w:p>
     <w:p>
       <w:pPr>
-        <w:spacing w:before="176" w:after="20"/>
-      </w:pPr>
-      <w:r>
-        <w:rPr>
-          <w:rFonts w:ascii="Lato" w:hAnsi="Lato" w:eastAsia="Lato" w:cs="Lato"/>
-          <w:b/>
-          <w:i w:val="0"/>
-          <w:color w:val="0F3D57"/>
-          <w:sz w:val="21"/>
-          <w:u w:val="none"/>
-        </w:rPr>
-        <w:t>15. Not All Retrievals are Useful: Cross-Attention for Input-Aware RAG in Time Series Forecasting (2026)</w:t>
-      </w:r>
-    </w:p>
-    <w:p>
-      <w:pPr>
         <w:spacing w:before="0" w:after="0"/>
       </w:pPr>
-      <w:r>
-        <w:rPr>
-          <w:rFonts w:ascii="Lato" w:hAnsi="Lato" w:eastAsia="Lato" w:cs="Lato"/>
-          <w:b w:val="0"/>
-          <w:i w:val="0"/>
-          <w:sz w:val="19"/>
-          <w:u w:val="none"/>
-        </w:rPr>
-        <w:t xml:space="preserve">- </w:t>
-      </w:r>
-      <w:r>
-        <w:rPr>
-          <w:rFonts w:ascii="Lato" w:hAnsi="Lato" w:eastAsia="Lato" w:cs="Lato"/>
-          <w:b/>
-          <w:i w:val="0"/>
-          <w:sz w:val="19"/>
-          <w:u w:val="none"/>
-        </w:rPr>
-        <w:t>Seunghan Lee</w:t>
-      </w:r>
-      <w:r>
-        <w:rPr>
-          <w:rFonts w:ascii="Lato" w:hAnsi="Lato" w:eastAsia="Lato" w:cs="Lato"/>
-          <w:b w:val="0"/>
-          <w:i w:val="0"/>
-          <w:sz w:val="19"/>
-          <w:u w:val="none"/>
-        </w:rPr>
-        <w:t>, Jaehoon Lee, Jun Seo, Sungdong Yoo, Minjae Kim, Tae Yoon Lim, Dongwan Kang, Hwanil Choi, SoonYoung Lee, Wonbin Ahn</w:t>
-      </w:r>
-    </w:p>
-    <w:p>
-      <w:pPr>
-        <w:spacing w:before="0" w:after="0"/>
-      </w:pPr>
-      <w:r>
-        <w:rPr>
-          <w:rFonts w:ascii="Lato" w:hAnsi="Lato" w:eastAsia="Lato" w:cs="Lato"/>
-          <w:b w:val="0"/>
-          <w:i w:val="0"/>
-          <w:sz w:val="19"/>
-          <w:u w:val="none"/>
-        </w:rPr>
-        <w:t xml:space="preserve">- In </w:t>
-      </w:r>
       <w:r>
         <w:rPr>
           <w:rFonts w:ascii="Lato" w:hAnsi="Lato" w:eastAsia="Lato" w:cs="Lato"/>
@@ -1966,7 +2287,7 @@
           <w:sz w:val="19"/>
           <w:u w:val="none"/>
         </w:rPr>
-        <w:t xml:space="preserve">KDDW (MILETS), 2026. </w:t>
+        <w:t xml:space="preserve">- Preliminary version: KDDW, 2026. </w:t>
       </w:r>
       <w:r>
         <w:rPr>
@@ -1977,7 +2298,73 @@
           <w:sz w:val="19"/>
           <w:u w:val="none"/>
         </w:rPr>
-        <w:t xml:space="preserve">Oral </w:t>
+        <w:t>Oral</w:t>
+      </w:r>
+    </w:p>
+    <w:p>
+      <w:pPr>
+        <w:spacing w:before="176" w:after="20"/>
+      </w:pPr>
+      <w:r>
+        <w:rPr>
+          <w:rFonts w:ascii="Lato" w:hAnsi="Lato" w:eastAsia="Lato" w:cs="Lato"/>
+          <w:b/>
+          <w:i w:val="0"/>
+          <w:color w:val="0F3D57"/>
+          <w:sz w:val="21"/>
+          <w:u w:val="none"/>
+        </w:rPr>
+        <w:t>15. Not All Retrievals are Useful: Cross-Attention for Input-Aware RAG in Time Series Forecasting (2026)</w:t>
+      </w:r>
+    </w:p>
+    <w:p>
+      <w:pPr>
+        <w:spacing w:before="0" w:after="0"/>
+      </w:pPr>
+      <w:r>
+        <w:rPr>
+          <w:rFonts w:ascii="Lato" w:hAnsi="Lato" w:eastAsia="Lato" w:cs="Lato"/>
+          <w:b w:val="0"/>
+          <w:i w:val="0"/>
+          <w:sz w:val="19"/>
+          <w:u w:val="none"/>
+        </w:rPr>
+        <w:t xml:space="preserve">- </w:t>
+      </w:r>
+      <w:r>
+        <w:rPr>
+          <w:rFonts w:ascii="Lato" w:hAnsi="Lato" w:eastAsia="Lato" w:cs="Lato"/>
+          <w:b/>
+          <w:i w:val="0"/>
+          <w:sz w:val="19"/>
+          <w:u w:val="none"/>
+        </w:rPr>
+        <w:t>Seunghan Lee</w:t>
+      </w:r>
+      <w:r>
+        <w:rPr>
+          <w:rFonts w:ascii="Lato" w:hAnsi="Lato" w:eastAsia="Lato" w:cs="Lato"/>
+          <w:b w:val="0"/>
+          <w:i w:val="0"/>
+          <w:sz w:val="19"/>
+          <w:u w:val="none"/>
+        </w:rPr>
+        <w:t>, Jaehoon Lee, Jun Seo, Sungdong Yoo, Minjae Kim, Tae Yoon Lim, Dongwan Kang, Hwanil Choi, SoonYoung Lee, Wonbin Ahn</w:t>
+      </w:r>
+    </w:p>
+    <w:p>
+      <w:pPr>
+        <w:spacing w:before="0" w:after="0"/>
+      </w:pPr>
+      <w:r>
+        <w:rPr>
+          <w:rFonts w:ascii="Lato" w:hAnsi="Lato" w:eastAsia="Lato" w:cs="Lato"/>
+          <w:b w:val="0"/>
+          <w:i w:val="0"/>
+          <w:sz w:val="19"/>
+          <w:u w:val="none"/>
+        </w:rPr>
+        <w:t xml:space="preserve">- In </w:t>
       </w:r>
       <w:r>
         <w:rPr>
@@ -1988,9 +2375,31 @@
           <w:sz w:val="19"/>
           <w:u w:val="none"/>
         </w:rPr>
+        <w:t xml:space="preserve">KDDW (MILETS), 2026. </w:t>
+      </w:r>
+      <w:r>
+        <w:rPr>
+          <w:rFonts w:ascii="Lato" w:hAnsi="Lato" w:eastAsia="Lato" w:cs="Lato"/>
+          <w:b w:val="0"/>
+          <w:i w:val="0"/>
+          <w:color w:val="C4761A"/>
+          <w:sz w:val="19"/>
+          <w:u w:val="none"/>
+        </w:rPr>
+        <w:t xml:space="preserve">Oral </w:t>
+      </w:r>
+      <w:r>
+        <w:rPr>
+          <w:rFonts w:ascii="Lato" w:hAnsi="Lato" w:eastAsia="Lato" w:cs="Lato"/>
+          <w:b w:val="0"/>
+          <w:i/>
+          <w:color w:val="4A4A4A"/>
+          <w:sz w:val="19"/>
+          <w:u w:val="none"/>
+        </w:rPr>
         <w:t>[</w:t>
       </w:r>
-      <w:hyperlink r:id="rId18">
+      <w:hyperlink r:id="rId22">
         <w:r>
           <w:rPr>
             <w:rFonts w:ascii="Lato" w:hAnsi="Lato" w:eastAsia="Lato" w:cs="Lato"/>
@@ -2113,7 +2522,7 @@
         </w:rPr>
         <w:t>[</w:t>
       </w:r>
-      <w:hyperlink r:id="rId19">
+      <w:hyperlink r:id="rId23">
         <w:r>
           <w:rPr>
             <w:rFonts w:ascii="Lato" w:hAnsi="Lato" w:eastAsia="Lato" w:cs="Lato"/>
@@ -2214,7 +2623,7 @@
         </w:rPr>
         <w:t>KDD, 2026. [</w:t>
       </w:r>
-      <w:hyperlink r:id="rId20">
+      <w:hyperlink r:id="rId24">
         <w:r>
           <w:rPr>
             <w:rFonts w:ascii="Lato" w:hAnsi="Lato" w:eastAsia="Lato" w:cs="Lato"/>
@@ -2315,7 +2724,7 @@
         </w:rPr>
         <w:t>ICML, 2026. [</w:t>
       </w:r>
-      <w:hyperlink r:id="rId21">
+      <w:hyperlink r:id="rId25">
         <w:r>
           <w:rPr>
             <w:rFonts w:ascii="Lato" w:hAnsi="Lato" w:eastAsia="Lato" w:cs="Lato"/>
@@ -2416,7 +2825,7 @@
         </w:rPr>
         <w:t>ICASSP, 2026. [</w:t>
       </w:r>
-      <w:hyperlink r:id="rId22">
+      <w:hyperlink r:id="rId26">
         <w:r>
           <w:rPr>
             <w:rFonts w:ascii="Lato" w:hAnsi="Lato" w:eastAsia="Lato" w:cs="Lato"/>
@@ -2626,7 +3035,7 @@
         </w:rPr>
         <w:t>ICML, 2025. [</w:t>
       </w:r>
-      <w:hyperlink r:id="rId23">
+      <w:hyperlink r:id="rId27">
         <w:r>
           <w:rPr>
             <w:rFonts w:ascii="Lato" w:hAnsi="Lato" w:eastAsia="Lato" w:cs="Lato"/>
@@ -2791,7 +3200,7 @@
         </w:rPr>
         <w:t>NeurIPSW (Time Series in the Age of Large Models) , 2024. [</w:t>
       </w:r>
-      <w:hyperlink r:id="rId24">
+      <w:hyperlink r:id="rId28">
         <w:r>
           <w:rPr>
             <w:rFonts w:ascii="Lato" w:hAnsi="Lato" w:eastAsia="Lato" w:cs="Lato"/>
@@ -2946,7 +3355,7 @@
         </w:rPr>
         <w:t>[</w:t>
       </w:r>
-      <w:hyperlink r:id="rId22">
+      <w:hyperlink r:id="rId26">
         <w:r>
           <w:rPr>
             <w:rFonts w:ascii="Lato" w:hAnsi="Lato" w:eastAsia="Lato" w:cs="Lato"/>
@@ -3079,7 +3488,7 @@
         </w:rPr>
         <w:t>NeurIPS, 2024. [</w:t>
       </w:r>
-      <w:hyperlink r:id="rId25">
+      <w:hyperlink r:id="rId29">
         <w:r>
           <w:rPr>
             <w:rFonts w:ascii="Lato" w:hAnsi="Lato" w:eastAsia="Lato" w:cs="Lato"/>
@@ -3226,7 +3635,7 @@
         </w:rPr>
         <w:t>ICLR, 2024. [</w:t>
       </w:r>
-      <w:hyperlink r:id="rId26">
+      <w:hyperlink r:id="rId30">
         <w:r>
           <w:rPr>
             <w:rFonts w:ascii="Lato" w:hAnsi="Lato" w:eastAsia="Lato" w:cs="Lato"/>
@@ -3376,7 +3785,7 @@
         </w:rPr>
         <w:t>[</w:t>
       </w:r>
-      <w:hyperlink r:id="rId27">
+      <w:hyperlink r:id="rId31">
         <w:r>
           <w:rPr>
             <w:rFonts w:ascii="Lato" w:hAnsi="Lato" w:eastAsia="Lato" w:cs="Lato"/>
@@ -6695,7 +7104,7 @@
         </w:rPr>
         <w:t>1st Semester: Contributed an article on AI in the Arts to IT Chosun (</w:t>
       </w:r>
-      <w:hyperlink r:id="rId28">
+      <w:hyperlink r:id="rId32">
         <w:r>
           <w:rPr>
             <w:rFonts w:ascii="Lato" w:hAnsi="Lato" w:eastAsia="Lato" w:cs="Lato"/>
@@ -12185,8 +12594,8 @@
       </w:r>
     </w:p>
     <w:sectPr>
-      <w:headerReference w:type="default" r:id="rId29"/>
-      <w:footerReference w:type="default" r:id="rId30"/>
+      <w:headerReference w:type="default" r:id="rId33"/>
+      <w:footerReference w:type="default" r:id="rId34"/>
       <w:pgSz w:w="11906" w:h="16838"/>
       <w:pgMar w:top="1020" w:right="964" w:bottom="1020" w:left="1077" w:header="0" w:footer="510" w:gutter="0"/>
       <w:cols w:space="720"/>

</xml_diff>

<commit_message>
Add TMLR 2026 reviewer role; give the CV an Academic Service section
The CV had no reviewer list at all, so section 6 "Academic Service" is new
and sections 6-13 shift to 7-14. Homepage gains a TMLR row. Still 12 pages.
</commit_message>
<xml_diff>
--- a/SeunghanLee_CV.docx
+++ b/SeunghanLee_CV.docx
@@ -6198,7 +6198,7 @@
           <w:sz w:val="29"/>
           <w:u w:val="none"/>
         </w:rPr>
-        <w:t>6. Invited Talks</w:t>
+        <w:t>6. Academic Service</w:t>
       </w:r>
     </w:p>
     <w:p>
@@ -6221,12 +6221,22 @@
       <w:r>
         <w:rPr>
           <w:rFonts w:ascii="Lato" w:hAnsi="Lato" w:eastAsia="Lato" w:cs="Lato"/>
-          <w:b w:val="0"/>
+          <w:b/>
           <w:i w:val="0"/>
           <w:sz w:val="20"/>
           <w:u w:val="none"/>
         </w:rPr>
-        <w:t>2024.08. Korean Artificial Intelligence Association (2024 Summer Conference)</w:t>
+        <w:t>Reviewer</w:t>
+      </w:r>
+      <w:r>
+        <w:rPr>
+          <w:rFonts w:ascii="Lato" w:hAnsi="Lato" w:eastAsia="Lato" w:cs="Lato"/>
+          <w:b w:val="0"/>
+          <w:i w:val="0"/>
+          <w:sz w:val="20"/>
+          <w:u w:val="none"/>
+        </w:rPr>
+        <w:t>: ICLR (2025, 2026), ICML (2024, 2025, 2026), NeurIPS (2024, 2025), EMNLP (2026), TMLR (2026)</w:t>
       </w:r>
     </w:p>
     <w:p>
@@ -6245,7 +6255,54 @@
           <w:sz w:val="29"/>
           <w:u w:val="none"/>
         </w:rPr>
-        <w:t>7. Intellectual Property</w:t>
+        <w:t>7. Invited Talks</w:t>
+      </w:r>
+    </w:p>
+    <w:p>
+      <w:pPr>
+        <w:spacing w:before="0" w:after="0"/>
+        <w:ind w:left="662" w:hanging="331"/>
+      </w:pPr>
+      <w:r>
+        <w:rPr>
+          <w:rFonts w:ascii="Lato" w:hAnsi="Lato" w:eastAsia="Lato" w:cs="Lato"/>
+          <w:b w:val="0"/>
+          <w:i w:val="0"/>
+          <w:color w:val="0F3D57"/>
+          <w:sz w:val="17"/>
+          <w:u w:val="none"/>
+        </w:rPr>
+        <w:t>•</w:t>
+        <w:tab/>
+      </w:r>
+      <w:r>
+        <w:rPr>
+          <w:rFonts w:ascii="Lato" w:hAnsi="Lato" w:eastAsia="Lato" w:cs="Lato"/>
+          <w:b w:val="0"/>
+          <w:i w:val="0"/>
+          <w:sz w:val="20"/>
+          <w:u w:val="none"/>
+        </w:rPr>
+        <w:t>2024.08. Korean Artificial Intelligence Association (2024 Summer Conference)</w:t>
+      </w:r>
+    </w:p>
+    <w:p>
+      <w:pPr>
+        <w:pBdr>
+          <w:bottom w:val="single" w:sz="14" w:space="2" w:color="C4761A"/>
+        </w:pBdr>
+        <w:spacing w:before="440" w:after="120" w:line="240" w:lineRule="auto"/>
+      </w:pPr>
+      <w:r>
+        <w:rPr>
+          <w:rFonts w:ascii="Lato" w:hAnsi="Lato" w:eastAsia="Lato" w:cs="Lato"/>
+          <w:b/>
+          <w:i w:val="0"/>
+          <w:color w:val="0F3D57"/>
+          <w:sz w:val="29"/>
+          <w:u w:val="none"/>
+        </w:rPr>
+        <w:t>8. Intellectual Property</w:t>
       </w:r>
     </w:p>
     <w:p>
@@ -6329,7 +6386,7 @@
           <w:sz w:val="29"/>
           <w:u w:val="none"/>
         </w:rPr>
-        <w:t>8. Programming Languages</w:t>
+        <w:t>9. Programming Languages</w:t>
       </w:r>
     </w:p>
     <w:p>
@@ -6462,7 +6519,7 @@
           <w:sz w:val="29"/>
           <w:u w:val="none"/>
         </w:rPr>
-        <w:t>9. Instructor, Teaching Assistant (TA)</w:t>
+        <w:t>10. Instructor, Teaching Assistant (TA)</w:t>
       </w:r>
     </w:p>
     <w:p>
@@ -6945,7 +7002,7 @@
           <w:sz w:val="29"/>
           <w:u w:val="none"/>
         </w:rPr>
-        <w:t>10. Academic Society &amp; Club</w:t>
+        <w:t>11. Academic Society &amp; Club</w:t>
       </w:r>
     </w:p>
     <w:p>
@@ -8307,7 +8364,7 @@
           <w:sz w:val="29"/>
           <w:u w:val="none"/>
         </w:rPr>
-        <w:t>11. Certifications &amp; Awards</w:t>
+        <w:t>12. Certifications &amp; Awards</w:t>
       </w:r>
     </w:p>
     <w:p>
@@ -10086,7 +10143,7 @@
           <w:sz w:val="29"/>
           <w:u w:val="none"/>
         </w:rPr>
-        <w:t>12. Projects</w:t>
+        <w:t>13. Projects</w:t>
       </w:r>
     </w:p>
     <w:p>
@@ -10580,7 +10637,7 @@
           <w:sz w:val="29"/>
           <w:u w:val="none"/>
         </w:rPr>
-        <w:t>13. Competitions</w:t>
+        <w:t>14. Competitions</w:t>
       </w:r>
     </w:p>
     <w:p>

</xml_diff>

<commit_message>
CV: add the two new 2026 papers and mark FinVerse a technical report
Mirrors the homepage: EXAONE Finance 1.0 (arXiv 2609.04239) and the
horizon-resolved attribution preprint (arXiv 2609.12639) join the list,
and FinVerse is relabelled from arXiv preprint to technical report.
</commit_message>
<xml_diff>
--- a/SeunghanLee_CV.docx
+++ b/SeunghanLee_CV.docx
@@ -1659,7 +1659,7 @@
           <w:sz w:val="21"/>
           <w:u w:val="none"/>
         </w:rPr>
-        <w:t>21. FinVerse: Financial Time-Series Benchmark (2026)</w:t>
+        <w:t>23. EXAONE Finance 1.0: An Attention-free Time Series Foundation Model for Financial Time Series (2026)</w:t>
       </w:r>
     </w:p>
     <w:p>
@@ -1674,7 +1674,7 @@
           <w:sz w:val="19"/>
           <w:u w:val="none"/>
         </w:rPr>
-        <w:t xml:space="preserve">- Jaehoon Lee, Jun Seo, </w:t>
+        <w:t xml:space="preserve">- </w:t>
       </w:r>
       <w:r>
         <w:rPr>
@@ -1694,7 +1694,7 @@
           <w:sz w:val="19"/>
           <w:u w:val="none"/>
         </w:rPr>
-        <w:t>, Tae Yoon Lim, Dongwan Kang, Hwanil Choi, Minjae Kim, Sungdong Yoo, Junhyeok Kang, Sangjun Han, Soonyoung Lee, Wonbin Ahn</w:t>
+        <w:t>, Jaehoon Lee, Jun Seo, Tae Yoon Lim, Dongwan Kang, Hwanil Choi, Minjae Kim, Sungdong Yoo, Junhyeok Kang, Sangjun Han, Soonyoung Lee, Wonbin Ahn</w:t>
       </w:r>
     </w:p>
     <w:p>
@@ -1720,9 +1720,211 @@
           <w:sz w:val="19"/>
           <w:u w:val="none"/>
         </w:rPr>
+        <w:t>Technical report, 2026. [</w:t>
+      </w:r>
+      <w:hyperlink r:id="rId16">
+        <w:r>
+          <w:rPr>
+            <w:rFonts w:ascii="Lato" w:hAnsi="Lato" w:eastAsia="Lato" w:cs="Lato"/>
+            <w:b w:val="0"/>
+            <w:i w:val="0"/>
+            <w:color w:val="0F3D57"/>
+            <w:sz w:val="19"/>
+            <w:u w:val="single"/>
+          </w:rPr>
+          <w:t>arxiv:2609.04239</w:t>
+        </w:r>
+      </w:hyperlink>
+      <w:r>
+        <w:rPr>
+          <w:rFonts w:ascii="Lato" w:hAnsi="Lato" w:eastAsia="Lato" w:cs="Lato"/>
+          <w:b w:val="0"/>
+          <w:i/>
+          <w:color w:val="4A4A4A"/>
+          <w:sz w:val="19"/>
+          <w:u w:val="none"/>
+        </w:rPr>
+        <w:t>]</w:t>
+      </w:r>
+    </w:p>
+    <w:p>
+      <w:pPr>
+        <w:spacing w:before="176" w:after="20"/>
+      </w:pPr>
+      <w:r>
+        <w:rPr>
+          <w:rFonts w:ascii="Lato" w:hAnsi="Lato" w:eastAsia="Lato" w:cs="Lato"/>
+          <w:b/>
+          <w:i w:val="0"/>
+          <w:color w:val="0F3D57"/>
+          <w:sz w:val="21"/>
+          <w:u w:val="none"/>
+        </w:rPr>
+        <w:t>22. Explaining Time Series Forecasting with Horizon-Resolved Attribution (2026)</w:t>
+      </w:r>
+    </w:p>
+    <w:p>
+      <w:pPr>
+        <w:spacing w:before="0" w:after="0"/>
+      </w:pPr>
+      <w:r>
+        <w:rPr>
+          <w:rFonts w:ascii="Lato" w:hAnsi="Lato" w:eastAsia="Lato" w:cs="Lato"/>
+          <w:b w:val="0"/>
+          <w:i w:val="0"/>
+          <w:sz w:val="19"/>
+          <w:u w:val="none"/>
+        </w:rPr>
+        <w:t xml:space="preserve">- </w:t>
+      </w:r>
+      <w:r>
+        <w:rPr>
+          <w:rFonts w:ascii="Lato" w:hAnsi="Lato" w:eastAsia="Lato" w:cs="Lato"/>
+          <w:b/>
+          <w:i w:val="0"/>
+          <w:sz w:val="19"/>
+          <w:u w:val="none"/>
+        </w:rPr>
+        <w:t>Seunghan Lee</w:t>
+      </w:r>
+      <w:r>
+        <w:rPr>
+          <w:rFonts w:ascii="Lato" w:hAnsi="Lato" w:eastAsia="Lato" w:cs="Lato"/>
+          <w:b w:val="0"/>
+          <w:i w:val="0"/>
+          <w:sz w:val="19"/>
+          <w:u w:val="none"/>
+        </w:rPr>
+        <w:t>, Jun Seo, Jaehoon Lee, Junhyeok Kang, Sangjun Han, Sungdong Yoo, Minjae Kim, Tae Yoon Lim, Dongwan Kang, Hwanil Choi, Soonyoung Lee, Wonbin Ahn</w:t>
+      </w:r>
+    </w:p>
+    <w:p>
+      <w:pPr>
+        <w:spacing w:before="0" w:after="0"/>
+      </w:pPr>
+      <w:r>
+        <w:rPr>
+          <w:rFonts w:ascii="Lato" w:hAnsi="Lato" w:eastAsia="Lato" w:cs="Lato"/>
+          <w:b w:val="0"/>
+          <w:i w:val="0"/>
+          <w:sz w:val="19"/>
+          <w:u w:val="none"/>
+        </w:rPr>
+        <w:t xml:space="preserve">- In </w:t>
+      </w:r>
+      <w:r>
+        <w:rPr>
+          <w:rFonts w:ascii="Lato" w:hAnsi="Lato" w:eastAsia="Lato" w:cs="Lato"/>
+          <w:b w:val="0"/>
+          <w:i/>
+          <w:color w:val="4A4A4A"/>
+          <w:sz w:val="19"/>
+          <w:u w:val="none"/>
+        </w:rPr>
         <w:t>arXiv preprint, 2026. [</w:t>
       </w:r>
-      <w:hyperlink r:id="rId16">
+      <w:hyperlink r:id="rId17">
+        <w:r>
+          <w:rPr>
+            <w:rFonts w:ascii="Lato" w:hAnsi="Lato" w:eastAsia="Lato" w:cs="Lato"/>
+            <w:b w:val="0"/>
+            <w:i w:val="0"/>
+            <w:color w:val="0F3D57"/>
+            <w:sz w:val="19"/>
+            <w:u w:val="single"/>
+          </w:rPr>
+          <w:t>arxiv:2609.12639</w:t>
+        </w:r>
+      </w:hyperlink>
+      <w:r>
+        <w:rPr>
+          <w:rFonts w:ascii="Lato" w:hAnsi="Lato" w:eastAsia="Lato" w:cs="Lato"/>
+          <w:b w:val="0"/>
+          <w:i/>
+          <w:color w:val="4A4A4A"/>
+          <w:sz w:val="19"/>
+          <w:u w:val="none"/>
+        </w:rPr>
+        <w:t>]</w:t>
+      </w:r>
+    </w:p>
+    <w:p>
+      <w:pPr>
+        <w:spacing w:before="176" w:after="20"/>
+      </w:pPr>
+      <w:r>
+        <w:rPr>
+          <w:rFonts w:ascii="Lato" w:hAnsi="Lato" w:eastAsia="Lato" w:cs="Lato"/>
+          <w:b/>
+          <w:i w:val="0"/>
+          <w:color w:val="0F3D57"/>
+          <w:sz w:val="21"/>
+          <w:u w:val="none"/>
+        </w:rPr>
+        <w:t>21. FinVerse: Financial Time-Series Benchmark (2026)</w:t>
+      </w:r>
+    </w:p>
+    <w:p>
+      <w:pPr>
+        <w:spacing w:before="0" w:after="0"/>
+      </w:pPr>
+      <w:r>
+        <w:rPr>
+          <w:rFonts w:ascii="Lato" w:hAnsi="Lato" w:eastAsia="Lato" w:cs="Lato"/>
+          <w:b w:val="0"/>
+          <w:i w:val="0"/>
+          <w:sz w:val="19"/>
+          <w:u w:val="none"/>
+        </w:rPr>
+        <w:t xml:space="preserve">- Jaehoon Lee, Jun Seo, </w:t>
+      </w:r>
+      <w:r>
+        <w:rPr>
+          <w:rFonts w:ascii="Lato" w:hAnsi="Lato" w:eastAsia="Lato" w:cs="Lato"/>
+          <w:b/>
+          <w:i w:val="0"/>
+          <w:sz w:val="19"/>
+          <w:u w:val="none"/>
+        </w:rPr>
+        <w:t>Seunghan Lee</w:t>
+      </w:r>
+      <w:r>
+        <w:rPr>
+          <w:rFonts w:ascii="Lato" w:hAnsi="Lato" w:eastAsia="Lato" w:cs="Lato"/>
+          <w:b w:val="0"/>
+          <w:i w:val="0"/>
+          <w:sz w:val="19"/>
+          <w:u w:val="none"/>
+        </w:rPr>
+        <w:t>, Tae Yoon Lim, Dongwan Kang, Hwanil Choi, Minjae Kim, Sungdong Yoo, Junhyeok Kang, Sangjun Han, Soonyoung Lee, Wonbin Ahn</w:t>
+      </w:r>
+    </w:p>
+    <w:p>
+      <w:pPr>
+        <w:spacing w:before="0" w:after="0"/>
+      </w:pPr>
+      <w:r>
+        <w:rPr>
+          <w:rFonts w:ascii="Lato" w:hAnsi="Lato" w:eastAsia="Lato" w:cs="Lato"/>
+          <w:b w:val="0"/>
+          <w:i w:val="0"/>
+          <w:sz w:val="19"/>
+          <w:u w:val="none"/>
+        </w:rPr>
+        <w:t xml:space="preserve">- In </w:t>
+      </w:r>
+      <w:r>
+        <w:rPr>
+          <w:rFonts w:ascii="Lato" w:hAnsi="Lato" w:eastAsia="Lato" w:cs="Lato"/>
+          <w:b w:val="0"/>
+          <w:i/>
+          <w:color w:val="4A4A4A"/>
+          <w:sz w:val="19"/>
+          <w:u w:val="none"/>
+        </w:rPr>
+        <w:t>Technical report, 2026. [</w:t>
+      </w:r>
+      <w:hyperlink r:id="rId18">
         <w:r>
           <w:rPr>
             <w:rFonts w:ascii="Lato" w:hAnsi="Lato" w:eastAsia="Lato" w:cs="Lato"/>
@@ -1823,7 +2025,7 @@
         </w:rPr>
         <w:t>arXiv preprint, 2026. [</w:t>
       </w:r>
-      <w:hyperlink r:id="rId17">
+      <w:hyperlink r:id="rId19">
         <w:r>
           <w:rPr>
             <w:rFonts w:ascii="Lato" w:hAnsi="Lato" w:eastAsia="Lato" w:cs="Lato"/>
@@ -1924,7 +2126,7 @@
         </w:rPr>
         <w:t>arXiv preprint, 2026. [</w:t>
       </w:r>
-      <w:hyperlink r:id="rId18">
+      <w:hyperlink r:id="rId20">
         <w:r>
           <w:rPr>
             <w:rFonts w:ascii="Lato" w:hAnsi="Lato" w:eastAsia="Lato" w:cs="Lato"/>
@@ -2025,7 +2227,7 @@
         </w:rPr>
         <w:t>EMNLP, 2026. [</w:t>
       </w:r>
-      <w:hyperlink r:id="rId19">
+      <w:hyperlink r:id="rId21">
         <w:r>
           <w:rPr>
             <w:rFonts w:ascii="Lato" w:hAnsi="Lato" w:eastAsia="Lato" w:cs="Lato"/>
@@ -2148,7 +2350,7 @@
         </w:rPr>
         <w:t>[</w:t>
       </w:r>
-      <w:hyperlink r:id="rId20">
+      <w:hyperlink r:id="rId22">
         <w:r>
           <w:rPr>
             <w:rFonts w:ascii="Lato" w:hAnsi="Lato" w:eastAsia="Lato" w:cs="Lato"/>
@@ -2249,7 +2451,7 @@
         </w:rPr>
         <w:t>EMNLP, 2026. [</w:t>
       </w:r>
-      <w:hyperlink r:id="rId21">
+      <w:hyperlink r:id="rId23">
         <w:r>
           <w:rPr>
             <w:rFonts w:ascii="Lato" w:hAnsi="Lato" w:eastAsia="Lato" w:cs="Lato"/>
@@ -2399,7 +2601,7 @@
         </w:rPr>
         <w:t>[</w:t>
       </w:r>
-      <w:hyperlink r:id="rId22">
+      <w:hyperlink r:id="rId24">
         <w:r>
           <w:rPr>
             <w:rFonts w:ascii="Lato" w:hAnsi="Lato" w:eastAsia="Lato" w:cs="Lato"/>
@@ -2522,7 +2724,7 @@
         </w:rPr>
         <w:t>[</w:t>
       </w:r>
-      <w:hyperlink r:id="rId23">
+      <w:hyperlink r:id="rId25">
         <w:r>
           <w:rPr>
             <w:rFonts w:ascii="Lato" w:hAnsi="Lato" w:eastAsia="Lato" w:cs="Lato"/>
@@ -2623,7 +2825,7 @@
         </w:rPr>
         <w:t>KDD, 2026. [</w:t>
       </w:r>
-      <w:hyperlink r:id="rId24">
+      <w:hyperlink r:id="rId26">
         <w:r>
           <w:rPr>
             <w:rFonts w:ascii="Lato" w:hAnsi="Lato" w:eastAsia="Lato" w:cs="Lato"/>
@@ -2724,7 +2926,7 @@
         </w:rPr>
         <w:t>ICML, 2026. [</w:t>
       </w:r>
-      <w:hyperlink r:id="rId25">
+      <w:hyperlink r:id="rId27">
         <w:r>
           <w:rPr>
             <w:rFonts w:ascii="Lato" w:hAnsi="Lato" w:eastAsia="Lato" w:cs="Lato"/>
@@ -2825,7 +3027,7 @@
         </w:rPr>
         <w:t>ICASSP, 2026. [</w:t>
       </w:r>
-      <w:hyperlink r:id="rId26">
+      <w:hyperlink r:id="rId28">
         <w:r>
           <w:rPr>
             <w:rFonts w:ascii="Lato" w:hAnsi="Lato" w:eastAsia="Lato" w:cs="Lato"/>
@@ -3035,7 +3237,7 @@
         </w:rPr>
         <w:t>ICML, 2025. [</w:t>
       </w:r>
-      <w:hyperlink r:id="rId27">
+      <w:hyperlink r:id="rId29">
         <w:r>
           <w:rPr>
             <w:rFonts w:ascii="Lato" w:hAnsi="Lato" w:eastAsia="Lato" w:cs="Lato"/>
@@ -3200,7 +3402,7 @@
         </w:rPr>
         <w:t>NeurIPSW (Time Series in the Age of Large Models) , 2024. [</w:t>
       </w:r>
-      <w:hyperlink r:id="rId28">
+      <w:hyperlink r:id="rId30">
         <w:r>
           <w:rPr>
             <w:rFonts w:ascii="Lato" w:hAnsi="Lato" w:eastAsia="Lato" w:cs="Lato"/>
@@ -3355,7 +3557,7 @@
         </w:rPr>
         <w:t>[</w:t>
       </w:r>
-      <w:hyperlink r:id="rId26">
+      <w:hyperlink r:id="rId28">
         <w:r>
           <w:rPr>
             <w:rFonts w:ascii="Lato" w:hAnsi="Lato" w:eastAsia="Lato" w:cs="Lato"/>
@@ -3488,7 +3690,7 @@
         </w:rPr>
         <w:t>NeurIPS, 2024. [</w:t>
       </w:r>
-      <w:hyperlink r:id="rId29">
+      <w:hyperlink r:id="rId31">
         <w:r>
           <w:rPr>
             <w:rFonts w:ascii="Lato" w:hAnsi="Lato" w:eastAsia="Lato" w:cs="Lato"/>
@@ -3635,7 +3837,7 @@
         </w:rPr>
         <w:t>ICLR, 2024. [</w:t>
       </w:r>
-      <w:hyperlink r:id="rId30">
+      <w:hyperlink r:id="rId32">
         <w:r>
           <w:rPr>
             <w:rFonts w:ascii="Lato" w:hAnsi="Lato" w:eastAsia="Lato" w:cs="Lato"/>
@@ -3785,7 +3987,7 @@
         </w:rPr>
         <w:t>[</w:t>
       </w:r>
-      <w:hyperlink r:id="rId31">
+      <w:hyperlink r:id="rId33">
         <w:r>
           <w:rPr>
             <w:rFonts w:ascii="Lato" w:hAnsi="Lato" w:eastAsia="Lato" w:cs="Lato"/>
@@ -7161,7 +7363,7 @@
         </w:rPr>
         <w:t>1st Semester: Contributed an article on AI in the Arts to IT Chosun (</w:t>
       </w:r>
-      <w:hyperlink r:id="rId32">
+      <w:hyperlink r:id="rId34">
         <w:r>
           <w:rPr>
             <w:rFonts w:ascii="Lato" w:hAnsi="Lato" w:eastAsia="Lato" w:cs="Lato"/>
@@ -12651,8 +12853,8 @@
       </w:r>
     </w:p>
     <w:sectPr>
-      <w:headerReference w:type="default" r:id="rId33"/>
-      <w:footerReference w:type="default" r:id="rId34"/>
+      <w:headerReference w:type="default" r:id="rId35"/>
+      <w:footerReference w:type="default" r:id="rId36"/>
       <w:pgSz w:w="11906" w:h="16838"/>
       <w:pgMar w:top="1020" w:right="964" w:bottom="1020" w:left="1077" w:header="0" w:footer="510" w:gutter="0"/>
       <w:cols w:space="720"/>

</xml_diff>

<commit_message>
Add EXAONE Demand 1.0 and PALM to the homepage and CV
EXAONE Demand 1.0 (arXiv 2609.30880) is listed as technical report T3
and PALM (arXiv 2609.30316) as preprint P4. Paper counts and the
research interest refs are updated to match. The CV gets the same two
entries (#25, #24) and the PDF/DOCX are rebuilt from build_cv.py.
</commit_message>
<xml_diff>
--- a/SeunghanLee_CV.docx
+++ b/SeunghanLee_CV.docx
@@ -1659,7 +1659,7 @@
           <w:sz w:val="21"/>
           <w:u w:val="none"/>
         </w:rPr>
-        <w:t>23. EXAONE Finance 1.0: An Attention-free Time Series Foundation Model for Financial Time Series (2026)</w:t>
+        <w:t>25. EXAONE Demand 1.0: A Time Series Foundation Model for Demand Forecasting (2026)</w:t>
       </w:r>
     </w:p>
     <w:p>
@@ -1694,7 +1694,7 @@
           <w:sz w:val="19"/>
           <w:u w:val="none"/>
         </w:rPr>
-        <w:t>, Jaehoon Lee, Jun Seo, Tae Yoon Lim, Dongwan Kang, Hwanil Choi, Minjae Kim, Sungdong Yoo, Junhyeok Kang, Sangjun Han, Soonyoung Lee, Wonbin Ahn</w:t>
+        <w:t>, Sangjun Han, Jun Seo, Junhyeok Kang, Jaehoon Lee, Tae Yoon Lim, Dongwan Kang, Hwanil Choi, Minjae Kim, Sungdong Yoo, Soonyoung Lee, Wonbin Ahn</w:t>
       </w:r>
     </w:p>
     <w:p>
@@ -1730,9 +1730,9 @@
             <w:i w:val="0"/>
             <w:color w:val="0F3D57"/>
             <w:sz w:val="19"/>
-            <w:u w:val="single"/>
+            <w:u w:val="none"/>
           </w:rPr>
-          <w:t>arxiv:2609.04239</w:t>
+          <w:t>arxiv:2609.30880</w:t>
         </w:r>
       </w:hyperlink>
       <w:r>
@@ -1760,7 +1760,7 @@
           <w:sz w:val="21"/>
           <w:u w:val="none"/>
         </w:rPr>
-        <w:t>22. Explaining Time Series Forecasting with Horizon-Resolved Attribution (2026)</w:t>
+        <w:t>24. PALM: Point-in-Time Adaptation for Financial Language Models (2026)</w:t>
       </w:r>
     </w:p>
     <w:p>
@@ -1831,9 +1831,9 @@
             <w:i w:val="0"/>
             <w:color w:val="0F3D57"/>
             <w:sz w:val="19"/>
-            <w:u w:val="single"/>
+            <w:u w:val="none"/>
           </w:rPr>
-          <w:t>arxiv:2609.12639</w:t>
+          <w:t>arxiv:2609.30316</w:t>
         </w:r>
       </w:hyperlink>
       <w:r>
@@ -1861,7 +1861,7 @@
           <w:sz w:val="21"/>
           <w:u w:val="none"/>
         </w:rPr>
-        <w:t>21. FinVerse: Financial Time-Series Benchmark (2026)</w:t>
+        <w:t>23. EXAONE Finance 1.0: An Attention-free Time Series Foundation Model for Financial Time Series (2026)</w:t>
       </w:r>
     </w:p>
     <w:p>
@@ -1876,7 +1876,7 @@
           <w:sz w:val="19"/>
           <w:u w:val="none"/>
         </w:rPr>
-        <w:t xml:space="preserve">- Jaehoon Lee, Jun Seo, </w:t>
+        <w:t xml:space="preserve">- </w:t>
       </w:r>
       <w:r>
         <w:rPr>
@@ -1896,7 +1896,7 @@
           <w:sz w:val="19"/>
           <w:u w:val="none"/>
         </w:rPr>
-        <w:t>, Tae Yoon Lim, Dongwan Kang, Hwanil Choi, Minjae Kim, Sungdong Yoo, Junhyeok Kang, Sangjun Han, Soonyoung Lee, Wonbin Ahn</w:t>
+        <w:t>, Jaehoon Lee, Jun Seo, Tae Yoon Lim, Dongwan Kang, Hwanil Choi, Minjae Kim, Sungdong Yoo, Junhyeok Kang, Sangjun Han, Soonyoung Lee, Wonbin Ahn</w:t>
       </w:r>
     </w:p>
     <w:p>
@@ -1932,9 +1932,9 @@
             <w:i w:val="0"/>
             <w:color w:val="0F3D57"/>
             <w:sz w:val="19"/>
-            <w:u w:val="single"/>
+            <w:u w:val="none"/>
           </w:rPr>
-          <w:t>arxiv:2608.03259</w:t>
+          <w:t>arxiv:2609.04239</w:t>
         </w:r>
       </w:hyperlink>
       <w:r>
@@ -1962,7 +1962,7 @@
           <w:sz w:val="21"/>
           <w:u w:val="none"/>
         </w:rPr>
-        <w:t>20. ReasonCast: Towards Explainable Time Series Forecasting with Reasoning (2026)</w:t>
+        <w:t>22. Explaining Time Series Forecasting with Horizon-Resolved Attribution (2026)</w:t>
       </w:r>
     </w:p>
     <w:p>
@@ -2033,9 +2033,9 @@
             <w:i w:val="0"/>
             <w:color w:val="0F3D57"/>
             <w:sz w:val="19"/>
-            <w:u w:val="single"/>
+            <w:u w:val="none"/>
           </w:rPr>
-          <w:t>arxiv:2608.01875</w:t>
+          <w:t>arxiv:2609.12639</w:t>
         </w:r>
       </w:hyperlink>
       <w:r>
@@ -2063,7 +2063,7 @@
           <w:sz w:val="21"/>
           <w:u w:val="none"/>
         </w:rPr>
-        <w:t>19. Beyond Magnitude and Shape: A Direction-Aware Loss for Time Series Forecasting (2026)</w:t>
+        <w:t>21. FinVerse: Financial Time-Series Benchmark (2026)</w:t>
       </w:r>
     </w:p>
     <w:p>
@@ -2078,7 +2078,7 @@
           <w:sz w:val="19"/>
           <w:u w:val="none"/>
         </w:rPr>
-        <w:t xml:space="preserve">- </w:t>
+        <w:t xml:space="preserve">- Jaehoon Lee, Jun Seo, </w:t>
       </w:r>
       <w:r>
         <w:rPr>
@@ -2098,7 +2098,7 @@
           <w:sz w:val="19"/>
           <w:u w:val="none"/>
         </w:rPr>
-        <w:t>, Jaehoon Lee, Jun Seo, Junhyeok Kang, Sangjun Han, Sungdong Yoo, Minjae Kim, Tae Yoon Lim, Dongwan Kang, Hwanil Choi, Soonyoung Lee, Wonbin Ahn</w:t>
+        <w:t>, Tae Yoon Lim, Dongwan Kang, Hwanil Choi, Minjae Kim, Sungdong Yoo, Junhyeok Kang, Sangjun Han, Soonyoung Lee, Wonbin Ahn</w:t>
       </w:r>
     </w:p>
     <w:p>
@@ -2124,7 +2124,7 @@
           <w:sz w:val="19"/>
           <w:u w:val="none"/>
         </w:rPr>
-        <w:t>arXiv preprint, 2026. [</w:t>
+        <w:t>Technical report, 2026. [</w:t>
       </w:r>
       <w:hyperlink r:id="rId20">
         <w:r>
@@ -2134,9 +2134,9 @@
             <w:i w:val="0"/>
             <w:color w:val="0F3D57"/>
             <w:sz w:val="19"/>
-            <w:u w:val="single"/>
+            <w:u w:val="none"/>
           </w:rPr>
-          <w:t>arxiv:2608.01857</w:t>
+          <w:t>arxiv:2608.03259</w:t>
         </w:r>
       </w:hyperlink>
       <w:r>
@@ -2164,7 +2164,7 @@
           <w:sz w:val="21"/>
           <w:u w:val="none"/>
         </w:rPr>
-        <w:t>18. When Summaries Distort Decisions: Information Fidelity in LLM-Compressed Financial Analysis (2026)</w:t>
+        <w:t>20. ReasonCast: Towards Explainable Time Series Forecasting with Reasoning (2026)</w:t>
       </w:r>
     </w:p>
     <w:p>
@@ -2179,7 +2179,7 @@
           <w:sz w:val="19"/>
           <w:u w:val="none"/>
         </w:rPr>
-        <w:t xml:space="preserve">- Hoyoung Lee, Suhwan Park, </w:t>
+        <w:t xml:space="preserve">- </w:t>
       </w:r>
       <w:r>
         <w:rPr>
@@ -2199,7 +2199,7 @@
           <w:sz w:val="19"/>
           <w:u w:val="none"/>
         </w:rPr>
-        <w:t>, Jun Seo, Jaehoon Lee, Sungdong Yoo, Minjae Kim, CheolWon Na, Zhangyang Wang, Zach Golkhou, Minkyu Kim, Sotirios Sabanis, Alejandro Lopez-Lira, Dhagash Mehta, Soonyoung Lee, Chanyeol Choi, Wonbin Ahn, Yongjae Lee</w:t>
+        <w:t>, Jun Seo, Jaehoon Lee, Junhyeok Kang, Sangjun Han, Sungdong Yoo, Minjae Kim, Tae Yoon Lim, Dongwan Kang, Hwanil Choi, Soonyoung Lee, Wonbin Ahn</w:t>
       </w:r>
     </w:p>
     <w:p>
@@ -2225,7 +2225,7 @@
           <w:sz w:val="19"/>
           <w:u w:val="none"/>
         </w:rPr>
-        <w:t>EMNLP, 2026. [</w:t>
+        <w:t>arXiv preprint, 2026. [</w:t>
       </w:r>
       <w:hyperlink r:id="rId21">
         <w:r>
@@ -2235,7 +2235,209 @@
             <w:i w:val="0"/>
             <w:color w:val="0F3D57"/>
             <w:sz w:val="19"/>
-            <w:u w:val="single"/>
+            <w:u w:val="none"/>
+          </w:rPr>
+          <w:t>arxiv:2608.01875</w:t>
+        </w:r>
+      </w:hyperlink>
+      <w:r>
+        <w:rPr>
+          <w:rFonts w:ascii="Lato" w:hAnsi="Lato" w:eastAsia="Lato" w:cs="Lato"/>
+          <w:b w:val="0"/>
+          <w:i/>
+          <w:color w:val="4A4A4A"/>
+          <w:sz w:val="19"/>
+          <w:u w:val="none"/>
+        </w:rPr>
+        <w:t>]</w:t>
+      </w:r>
+    </w:p>
+    <w:p>
+      <w:pPr>
+        <w:spacing w:before="176" w:after="20"/>
+      </w:pPr>
+      <w:r>
+        <w:rPr>
+          <w:rFonts w:ascii="Lato" w:hAnsi="Lato" w:eastAsia="Lato" w:cs="Lato"/>
+          <w:b/>
+          <w:i w:val="0"/>
+          <w:color w:val="0F3D57"/>
+          <w:sz w:val="21"/>
+          <w:u w:val="none"/>
+        </w:rPr>
+        <w:t>19. Beyond Magnitude and Shape: A Direction-Aware Loss for Time Series Forecasting (2026)</w:t>
+      </w:r>
+    </w:p>
+    <w:p>
+      <w:pPr>
+        <w:spacing w:before="0" w:after="0"/>
+      </w:pPr>
+      <w:r>
+        <w:rPr>
+          <w:rFonts w:ascii="Lato" w:hAnsi="Lato" w:eastAsia="Lato" w:cs="Lato"/>
+          <w:b w:val="0"/>
+          <w:i w:val="0"/>
+          <w:sz w:val="19"/>
+          <w:u w:val="none"/>
+        </w:rPr>
+        <w:t xml:space="preserve">- </w:t>
+      </w:r>
+      <w:r>
+        <w:rPr>
+          <w:rFonts w:ascii="Lato" w:hAnsi="Lato" w:eastAsia="Lato" w:cs="Lato"/>
+          <w:b/>
+          <w:i w:val="0"/>
+          <w:sz w:val="19"/>
+          <w:u w:val="none"/>
+        </w:rPr>
+        <w:t>Seunghan Lee</w:t>
+      </w:r>
+      <w:r>
+        <w:rPr>
+          <w:rFonts w:ascii="Lato" w:hAnsi="Lato" w:eastAsia="Lato" w:cs="Lato"/>
+          <w:b w:val="0"/>
+          <w:i w:val="0"/>
+          <w:sz w:val="19"/>
+          <w:u w:val="none"/>
+        </w:rPr>
+        <w:t>, Jaehoon Lee, Jun Seo, Junhyeok Kang, Sangjun Han, Sungdong Yoo, Minjae Kim, Tae Yoon Lim, Dongwan Kang, Hwanil Choi, Soonyoung Lee, Wonbin Ahn</w:t>
+      </w:r>
+    </w:p>
+    <w:p>
+      <w:pPr>
+        <w:spacing w:before="0" w:after="0"/>
+      </w:pPr>
+      <w:r>
+        <w:rPr>
+          <w:rFonts w:ascii="Lato" w:hAnsi="Lato" w:eastAsia="Lato" w:cs="Lato"/>
+          <w:b w:val="0"/>
+          <w:i w:val="0"/>
+          <w:sz w:val="19"/>
+          <w:u w:val="none"/>
+        </w:rPr>
+        <w:t xml:space="preserve">- In </w:t>
+      </w:r>
+      <w:r>
+        <w:rPr>
+          <w:rFonts w:ascii="Lato" w:hAnsi="Lato" w:eastAsia="Lato" w:cs="Lato"/>
+          <w:b w:val="0"/>
+          <w:i/>
+          <w:color w:val="4A4A4A"/>
+          <w:sz w:val="19"/>
+          <w:u w:val="none"/>
+        </w:rPr>
+        <w:t>arXiv preprint, 2026. [</w:t>
+      </w:r>
+      <w:hyperlink r:id="rId22">
+        <w:r>
+          <w:rPr>
+            <w:rFonts w:ascii="Lato" w:hAnsi="Lato" w:eastAsia="Lato" w:cs="Lato"/>
+            <w:b w:val="0"/>
+            <w:i w:val="0"/>
+            <w:color w:val="0F3D57"/>
+            <w:sz w:val="19"/>
+            <w:u w:val="none"/>
+          </w:rPr>
+          <w:t>arxiv:2608.01857</w:t>
+        </w:r>
+      </w:hyperlink>
+      <w:r>
+        <w:rPr>
+          <w:rFonts w:ascii="Lato" w:hAnsi="Lato" w:eastAsia="Lato" w:cs="Lato"/>
+          <w:b w:val="0"/>
+          <w:i/>
+          <w:color w:val="4A4A4A"/>
+          <w:sz w:val="19"/>
+          <w:u w:val="none"/>
+        </w:rPr>
+        <w:t>]</w:t>
+      </w:r>
+    </w:p>
+    <w:p>
+      <w:pPr>
+        <w:spacing w:before="176" w:after="20"/>
+      </w:pPr>
+      <w:r>
+        <w:rPr>
+          <w:rFonts w:ascii="Lato" w:hAnsi="Lato" w:eastAsia="Lato" w:cs="Lato"/>
+          <w:b/>
+          <w:i w:val="0"/>
+          <w:color w:val="0F3D57"/>
+          <w:sz w:val="21"/>
+          <w:u w:val="none"/>
+        </w:rPr>
+        <w:t>18. When Summaries Distort Decisions: Information Fidelity in LLM-Compressed Financial Analysis (2026)</w:t>
+      </w:r>
+    </w:p>
+    <w:p>
+      <w:pPr>
+        <w:spacing w:before="0" w:after="0"/>
+      </w:pPr>
+      <w:r>
+        <w:rPr>
+          <w:rFonts w:ascii="Lato" w:hAnsi="Lato" w:eastAsia="Lato" w:cs="Lato"/>
+          <w:b w:val="0"/>
+          <w:i w:val="0"/>
+          <w:sz w:val="19"/>
+          <w:u w:val="none"/>
+        </w:rPr>
+        <w:t xml:space="preserve">- Hoyoung Lee, Suhwan Park, </w:t>
+      </w:r>
+      <w:r>
+        <w:rPr>
+          <w:rFonts w:ascii="Lato" w:hAnsi="Lato" w:eastAsia="Lato" w:cs="Lato"/>
+          <w:b/>
+          <w:i w:val="0"/>
+          <w:sz w:val="19"/>
+          <w:u w:val="none"/>
+        </w:rPr>
+        <w:t>Seunghan Lee</w:t>
+      </w:r>
+      <w:r>
+        <w:rPr>
+          <w:rFonts w:ascii="Lato" w:hAnsi="Lato" w:eastAsia="Lato" w:cs="Lato"/>
+          <w:b w:val="0"/>
+          <w:i w:val="0"/>
+          <w:sz w:val="19"/>
+          <w:u w:val="none"/>
+        </w:rPr>
+        <w:t>, Jun Seo, Jaehoon Lee, Sungdong Yoo, Minjae Kim, CheolWon Na, Zhangyang Wang, Zach Golkhou, Minkyu Kim, Sotirios Sabanis, Alejandro Lopez-Lira, Dhagash Mehta, Soonyoung Lee, Chanyeol Choi, Wonbin Ahn, Yongjae Lee</w:t>
+      </w:r>
+    </w:p>
+    <w:p>
+      <w:pPr>
+        <w:spacing w:before="0" w:after="0"/>
+      </w:pPr>
+      <w:r>
+        <w:rPr>
+          <w:rFonts w:ascii="Lato" w:hAnsi="Lato" w:eastAsia="Lato" w:cs="Lato"/>
+          <w:b w:val="0"/>
+          <w:i w:val="0"/>
+          <w:sz w:val="19"/>
+          <w:u w:val="none"/>
+        </w:rPr>
+        <w:t xml:space="preserve">- In </w:t>
+      </w:r>
+      <w:r>
+        <w:rPr>
+          <w:rFonts w:ascii="Lato" w:hAnsi="Lato" w:eastAsia="Lato" w:cs="Lato"/>
+          <w:b w:val="0"/>
+          <w:i/>
+          <w:color w:val="4A4A4A"/>
+          <w:sz w:val="19"/>
+          <w:u w:val="none"/>
+        </w:rPr>
+        <w:t>EMNLP, 2026. [</w:t>
+      </w:r>
+      <w:hyperlink r:id="rId23">
+        <w:r>
+          <w:rPr>
+            <w:rFonts w:ascii="Lato" w:hAnsi="Lato" w:eastAsia="Lato" w:cs="Lato"/>
+            <w:b w:val="0"/>
+            <w:i w:val="0"/>
+            <w:color w:val="0F3D57"/>
+            <w:sz w:val="19"/>
+            <w:u w:val="none"/>
           </w:rPr>
           <w:t>arxiv:2606.29251</w:t>
         </w:r>
@@ -2350,7 +2552,7 @@
         </w:rPr>
         <w:t>[</w:t>
       </w:r>
-      <w:hyperlink r:id="rId22">
+      <w:hyperlink r:id="rId24">
         <w:r>
           <w:rPr>
             <w:rFonts w:ascii="Lato" w:hAnsi="Lato" w:eastAsia="Lato" w:cs="Lato"/>
@@ -2451,7 +2653,7 @@
         </w:rPr>
         <w:t>EMNLP, 2026. [</w:t>
       </w:r>
-      <w:hyperlink r:id="rId23">
+      <w:hyperlink r:id="rId25">
         <w:r>
           <w:rPr>
             <w:rFonts w:ascii="Lato" w:hAnsi="Lato" w:eastAsia="Lato" w:cs="Lato"/>
@@ -2459,7 +2661,7 @@
             <w:i w:val="0"/>
             <w:color w:val="0F3D57"/>
             <w:sz w:val="19"/>
-            <w:u w:val="single"/>
+            <w:u w:val="none"/>
           </w:rPr>
           <w:t>arxiv:2605.03460</w:t>
         </w:r>
@@ -2601,7 +2803,7 @@
         </w:rPr>
         <w:t>[</w:t>
       </w:r>
-      <w:hyperlink r:id="rId24">
+      <w:hyperlink r:id="rId26">
         <w:r>
           <w:rPr>
             <w:rFonts w:ascii="Lato" w:hAnsi="Lato" w:eastAsia="Lato" w:cs="Lato"/>
@@ -2724,7 +2926,7 @@
         </w:rPr>
         <w:t>[</w:t>
       </w:r>
-      <w:hyperlink r:id="rId25">
+      <w:hyperlink r:id="rId27">
         <w:r>
           <w:rPr>
             <w:rFonts w:ascii="Lato" w:hAnsi="Lato" w:eastAsia="Lato" w:cs="Lato"/>
@@ -2825,7 +3027,7 @@
         </w:rPr>
         <w:t>KDD, 2026. [</w:t>
       </w:r>
-      <w:hyperlink r:id="rId26">
+      <w:hyperlink r:id="rId28">
         <w:r>
           <w:rPr>
             <w:rFonts w:ascii="Lato" w:hAnsi="Lato" w:eastAsia="Lato" w:cs="Lato"/>
@@ -2833,7 +3035,7 @@
             <w:i w:val="0"/>
             <w:color w:val="0F3D57"/>
             <w:sz w:val="19"/>
-            <w:u w:val="single"/>
+            <w:u w:val="none"/>
           </w:rPr>
           <w:t>arxiv:2603.02702</w:t>
         </w:r>
@@ -2926,7 +3128,7 @@
         </w:rPr>
         <w:t>ICML, 2026. [</w:t>
       </w:r>
-      <w:hyperlink r:id="rId27">
+      <w:hyperlink r:id="rId29">
         <w:r>
           <w:rPr>
             <w:rFonts w:ascii="Lato" w:hAnsi="Lato" w:eastAsia="Lato" w:cs="Lato"/>
@@ -2934,7 +3136,7 @@
             <w:i w:val="0"/>
             <w:color w:val="0F3D57"/>
             <w:sz w:val="19"/>
-            <w:u w:val="single"/>
+            <w:u w:val="none"/>
           </w:rPr>
           <w:t>arxiv:2605.04363</w:t>
         </w:r>
@@ -3027,7 +3229,7 @@
         </w:rPr>
         <w:t>ICASSP, 2026. [</w:t>
       </w:r>
-      <w:hyperlink r:id="rId28">
+      <w:hyperlink r:id="rId30">
         <w:r>
           <w:rPr>
             <w:rFonts w:ascii="Lato" w:hAnsi="Lato" w:eastAsia="Lato" w:cs="Lato"/>
@@ -3237,7 +3439,7 @@
         </w:rPr>
         <w:t>ICML, 2025. [</w:t>
       </w:r>
-      <w:hyperlink r:id="rId29">
+      <w:hyperlink r:id="rId31">
         <w:r>
           <w:rPr>
             <w:rFonts w:ascii="Lato" w:hAnsi="Lato" w:eastAsia="Lato" w:cs="Lato"/>
@@ -3402,7 +3604,7 @@
         </w:rPr>
         <w:t>NeurIPSW (Time Series in the Age of Large Models) , 2024. [</w:t>
       </w:r>
-      <w:hyperlink r:id="rId30">
+      <w:hyperlink r:id="rId32">
         <w:r>
           <w:rPr>
             <w:rFonts w:ascii="Lato" w:hAnsi="Lato" w:eastAsia="Lato" w:cs="Lato"/>
@@ -3557,7 +3759,7 @@
         </w:rPr>
         <w:t>[</w:t>
       </w:r>
-      <w:hyperlink r:id="rId28">
+      <w:hyperlink r:id="rId30">
         <w:r>
           <w:rPr>
             <w:rFonts w:ascii="Lato" w:hAnsi="Lato" w:eastAsia="Lato" w:cs="Lato"/>
@@ -3690,7 +3892,7 @@
         </w:rPr>
         <w:t>NeurIPS, 2024. [</w:t>
       </w:r>
-      <w:hyperlink r:id="rId31">
+      <w:hyperlink r:id="rId33">
         <w:r>
           <w:rPr>
             <w:rFonts w:ascii="Lato" w:hAnsi="Lato" w:eastAsia="Lato" w:cs="Lato"/>
@@ -3837,7 +4039,7 @@
         </w:rPr>
         <w:t>ICLR, 2024. [</w:t>
       </w:r>
-      <w:hyperlink r:id="rId32">
+      <w:hyperlink r:id="rId34">
         <w:r>
           <w:rPr>
             <w:rFonts w:ascii="Lato" w:hAnsi="Lato" w:eastAsia="Lato" w:cs="Lato"/>
@@ -3987,7 +4189,7 @@
         </w:rPr>
         <w:t>[</w:t>
       </w:r>
-      <w:hyperlink r:id="rId33">
+      <w:hyperlink r:id="rId35">
         <w:r>
           <w:rPr>
             <w:rFonts w:ascii="Lato" w:hAnsi="Lato" w:eastAsia="Lato" w:cs="Lato"/>
@@ -7363,7 +7565,7 @@
         </w:rPr>
         <w:t>1st Semester: Contributed an article on AI in the Arts to IT Chosun (</w:t>
       </w:r>
-      <w:hyperlink r:id="rId34">
+      <w:hyperlink r:id="rId36">
         <w:r>
           <w:rPr>
             <w:rFonts w:ascii="Lato" w:hAnsi="Lato" w:eastAsia="Lato" w:cs="Lato"/>
@@ -12853,8 +13055,8 @@
       </w:r>
     </w:p>
     <w:sectPr>
-      <w:headerReference w:type="default" r:id="rId35"/>
-      <w:footerReference w:type="default" r:id="rId36"/>
+      <w:headerReference w:type="default" r:id="rId37"/>
+      <w:footerReference w:type="default" r:id="rId38"/>
       <w:pgSz w:w="11906" w:h="16838"/>
       <w:pgMar w:top="1020" w:right="964" w:bottom="1020" w:left="1077" w:header="0" w:footer="510" w:gutter="0"/>
       <w:cols w:space="720"/>

</xml_diff>

<commit_message>
Publications: add two NeurIPS 2026 Workshop (FMTS) papers
Composite Kernel Decomposition of GP for TSFMs (W11) and Quantile
Alignment for zero-shot TSFMs (W12). Links are TBD for now. Counts and
the foundation-model research refs are updated, and the CV gets the
same entries (#26, #27) with the PDF/DOCX rebuilt.
</commit_message>
<xml_diff>
--- a/SeunghanLee_CV.docx
+++ b/SeunghanLee_CV.docx
@@ -1644,6 +1644,160 @@
           <w:u w:val="none"/>
         </w:rPr>
         <w:t>Co-corresponding Authors)</w:t>
+      </w:r>
+    </w:p>
+    <w:p>
+      <w:pPr>
+        <w:spacing w:before="176" w:after="20"/>
+      </w:pPr>
+      <w:r>
+        <w:rPr>
+          <w:rFonts w:ascii="Lato" w:hAnsi="Lato" w:eastAsia="Lato" w:cs="Lato"/>
+          <w:b/>
+          <w:i w:val="0"/>
+          <w:color w:val="0F3D57"/>
+          <w:sz w:val="21"/>
+          <w:u w:val="none"/>
+        </w:rPr>
+        <w:t>27. Quantile Alignment Improves Zero-Shot Time-Series Foundation Models (2026)</w:t>
+      </w:r>
+    </w:p>
+    <w:p>
+      <w:pPr>
+        <w:spacing w:before="0" w:after="0"/>
+      </w:pPr>
+      <w:r>
+        <w:rPr>
+          <w:rFonts w:ascii="Lato" w:hAnsi="Lato" w:eastAsia="Lato" w:cs="Lato"/>
+          <w:b w:val="0"/>
+          <w:i w:val="0"/>
+          <w:sz w:val="19"/>
+          <w:u w:val="none"/>
+        </w:rPr>
+        <w:t xml:space="preserve">- Junhyeok Kang, Sangjun Han, Jun Seo, </w:t>
+      </w:r>
+      <w:r>
+        <w:rPr>
+          <w:rFonts w:ascii="Lato" w:hAnsi="Lato" w:eastAsia="Lato" w:cs="Lato"/>
+          <w:b/>
+          <w:i w:val="0"/>
+          <w:sz w:val="19"/>
+          <w:u w:val="none"/>
+        </w:rPr>
+        <w:t>Seunghan Lee</w:t>
+      </w:r>
+      <w:r>
+        <w:rPr>
+          <w:rFonts w:ascii="Lato" w:hAnsi="Lato" w:eastAsia="Lato" w:cs="Lato"/>
+          <w:b w:val="0"/>
+          <w:i w:val="0"/>
+          <w:sz w:val="19"/>
+          <w:u w:val="none"/>
+        </w:rPr>
+        <w:t>, Jaehoon Lee, Dongwan Kang, Minjae Kim, Sungdong Yoo, Tae Yoon Lim, Hwanil Choi, Soonyoung Lee, Wonbin Ahn</w:t>
+      </w:r>
+    </w:p>
+    <w:p>
+      <w:pPr>
+        <w:spacing w:before="0" w:after="0"/>
+      </w:pPr>
+      <w:r>
+        <w:rPr>
+          <w:rFonts w:ascii="Lato" w:hAnsi="Lato" w:eastAsia="Lato" w:cs="Lato"/>
+          <w:b w:val="0"/>
+          <w:i w:val="0"/>
+          <w:sz w:val="19"/>
+          <w:u w:val="none"/>
+        </w:rPr>
+        <w:t xml:space="preserve">- In </w:t>
+      </w:r>
+      <w:r>
+        <w:rPr>
+          <w:rFonts w:ascii="Lato" w:hAnsi="Lato" w:eastAsia="Lato" w:cs="Lato"/>
+          <w:b w:val="0"/>
+          <w:i/>
+          <w:color w:val="4A4A4A"/>
+          <w:sz w:val="19"/>
+          <w:u w:val="none"/>
+        </w:rPr>
+        <w:t>NeurIPSW (FMTS), 2026. [TBD]</w:t>
+      </w:r>
+    </w:p>
+    <w:p>
+      <w:pPr>
+        <w:spacing w:before="176" w:after="20"/>
+      </w:pPr>
+      <w:r>
+        <w:rPr>
+          <w:rFonts w:ascii="Lato" w:hAnsi="Lato" w:eastAsia="Lato" w:cs="Lato"/>
+          <w:b/>
+          <w:i w:val="0"/>
+          <w:color w:val="0F3D57"/>
+          <w:sz w:val="21"/>
+          <w:u w:val="none"/>
+        </w:rPr>
+        <w:t>26. Composite Kernel Decomposition of Gaussian Process for Time-Series Foundation Models (2026)</w:t>
+      </w:r>
+    </w:p>
+    <w:p>
+      <w:pPr>
+        <w:spacing w:before="0" w:after="0"/>
+      </w:pPr>
+      <w:r>
+        <w:rPr>
+          <w:rFonts w:ascii="Lato" w:hAnsi="Lato" w:eastAsia="Lato" w:cs="Lato"/>
+          <w:b w:val="0"/>
+          <w:i w:val="0"/>
+          <w:sz w:val="19"/>
+          <w:u w:val="none"/>
+        </w:rPr>
+        <w:t xml:space="preserve">- Sangjun Han, Hyunoh Yeo, Joanie Hayoun Chung, Junhyeok Kang, </w:t>
+      </w:r>
+      <w:r>
+        <w:rPr>
+          <w:rFonts w:ascii="Lato" w:hAnsi="Lato" w:eastAsia="Lato" w:cs="Lato"/>
+          <w:b/>
+          <w:i w:val="0"/>
+          <w:sz w:val="19"/>
+          <w:u w:val="none"/>
+        </w:rPr>
+        <w:t>Seunghan Lee</w:t>
+      </w:r>
+      <w:r>
+        <w:rPr>
+          <w:rFonts w:ascii="Lato" w:hAnsi="Lato" w:eastAsia="Lato" w:cs="Lato"/>
+          <w:b w:val="0"/>
+          <w:i w:val="0"/>
+          <w:sz w:val="19"/>
+          <w:u w:val="none"/>
+        </w:rPr>
+        <w:t>, Jaehoon Lee, Jun Seo, Tae Yoon Lim, Dongwan Kang, Hwanil Choi, Minjae Kim, Sungdong Yoo, Soonyoung Lee, Wonbin Ahn</w:t>
+      </w:r>
+    </w:p>
+    <w:p>
+      <w:pPr>
+        <w:spacing w:before="0" w:after="0"/>
+      </w:pPr>
+      <w:r>
+        <w:rPr>
+          <w:rFonts w:ascii="Lato" w:hAnsi="Lato" w:eastAsia="Lato" w:cs="Lato"/>
+          <w:b w:val="0"/>
+          <w:i w:val="0"/>
+          <w:sz w:val="19"/>
+          <w:u w:val="none"/>
+        </w:rPr>
+        <w:t xml:space="preserve">- In </w:t>
+      </w:r>
+      <w:r>
+        <w:rPr>
+          <w:rFonts w:ascii="Lato" w:hAnsi="Lato" w:eastAsia="Lato" w:cs="Lato"/>
+          <w:b w:val="0"/>
+          <w:i/>
+          <w:color w:val="4A4A4A"/>
+          <w:sz w:val="19"/>
+          <w:u w:val="none"/>
+        </w:rPr>
+        <w:t>NeurIPSW (FMTS), 2026. [TBD]</w:t>
       </w:r>
     </w:p>
     <w:p>

</xml_diff>

<commit_message>
Publications: list the label-shift ICML 2026 paper as single-author
Homepage and CV updated together; the CV PDF/DOCX are rebuilt.
</commit_message>
<xml_diff>
--- a/SeunghanLee_CV.docx
+++ b/SeunghanLee_CV.docx
@@ -3245,16 +3245,6 @@
           <w:u w:val="none"/>
         </w:rPr>
         <w:t>Seunghan Lee</w:t>
-      </w:r>
-      <w:r>
-        <w:rPr>
-          <w:rFonts w:ascii="Lato" w:hAnsi="Lato" w:eastAsia="Lato" w:cs="Lato"/>
-          <w:b w:val="0"/>
-          <w:i w:val="0"/>
-          <w:sz w:val="19"/>
-          <w:u w:val="none"/>
-        </w:rPr>
-        <w:t>, Jaehoon Lee, Jun Seo, Sungdong Yoo, Minjae Kim, Tae Yoon Lim, Dongwan Kang, Hwanil Choi, SoonYoung Lee, Wonbin Ahn</w:t>
       </w:r>
     </w:p>
     <w:p>

</xml_diff>

<commit_message>
Current Work: add EXAONE Finance/Demand and explainable TS forecasting
</commit_message>
<xml_diff>
--- a/SeunghanLee_CV.docx
+++ b/SeunghanLee_CV.docx
@@ -4851,7 +4851,7 @@
           <w:sz w:val="20"/>
           <w:u w:val="none"/>
         </w:rPr>
-        <w:t>① TS foundation model for financial assets</w:t>
+        <w:t>① EXAONE Finance: TS foundation model for financial assets</w:t>
       </w:r>
     </w:p>
     <w:p>
@@ -4879,7 +4879,7 @@
           <w:sz w:val="20"/>
           <w:u w:val="none"/>
         </w:rPr>
-        <w:t>② Financial TS forecasting (Equity, Macro, Fundamental, etc.)</w:t>
+        <w:t>② EXAONE Demand: TS foundation model for demand forecasting</w:t>
       </w:r>
     </w:p>
     <w:p>
@@ -4907,7 +4907,7 @@
           <w:sz w:val="20"/>
           <w:u w:val="none"/>
         </w:rPr>
-        <w:t>③ Multimodal TS forecasting (TS + Text)</w:t>
+        <w:t>③ Financial TS forecasting (Equity, Macro, Fundamental, etc.)</w:t>
       </w:r>
     </w:p>
     <w:p>
@@ -4935,7 +4935,7 @@
           <w:sz w:val="20"/>
           <w:u w:val="none"/>
         </w:rPr>
-        <w:t>④ Agentic TS forecasting</w:t>
+        <w:t>④ Multimodal TS forecasting (TS + Text)</w:t>
       </w:r>
     </w:p>
     <w:p>
@@ -4964,6 +4964,62 @@
           <w:u w:val="none"/>
         </w:rPr>
         <w:t>⑤ Supply Chain Knowledge Graph</w:t>
+      </w:r>
+    </w:p>
+    <w:p>
+      <w:pPr>
+        <w:spacing w:before="0" w:after="0"/>
+        <w:ind w:left="1325" w:hanging="331"/>
+      </w:pPr>
+      <w:r>
+        <w:rPr>
+          <w:rFonts w:ascii="Lato" w:hAnsi="Lato" w:eastAsia="Lato" w:cs="Lato"/>
+          <w:b w:val="0"/>
+          <w:i w:val="0"/>
+          <w:color w:val="0F3D57"/>
+          <w:sz w:val="16"/>
+          <w:u w:val="none"/>
+        </w:rPr>
+        <w:t>◦</w:t>
+        <w:tab/>
+      </w:r>
+      <w:r>
+        <w:rPr>
+          <w:rFonts w:ascii="Lato" w:hAnsi="Lato" w:eastAsia="Lato" w:cs="Lato"/>
+          <w:b w:val="0"/>
+          <w:i w:val="0"/>
+          <w:sz w:val="20"/>
+          <w:u w:val="none"/>
+        </w:rPr>
+        <w:t>⑥ TS reasoning model</w:t>
+      </w:r>
+    </w:p>
+    <w:p>
+      <w:pPr>
+        <w:spacing w:before="0" w:after="0"/>
+        <w:ind w:left="1325" w:hanging="331"/>
+      </w:pPr>
+      <w:r>
+        <w:rPr>
+          <w:rFonts w:ascii="Lato" w:hAnsi="Lato" w:eastAsia="Lato" w:cs="Lato"/>
+          <w:b w:val="0"/>
+          <w:i w:val="0"/>
+          <w:color w:val="0F3D57"/>
+          <w:sz w:val="16"/>
+          <w:u w:val="none"/>
+        </w:rPr>
+        <w:t>◦</w:t>
+        <w:tab/>
+      </w:r>
+      <w:r>
+        <w:rPr>
+          <w:rFonts w:ascii="Lato" w:hAnsi="Lato" w:eastAsia="Lato" w:cs="Lato"/>
+          <w:b w:val="0"/>
+          <w:i w:val="0"/>
+          <w:sz w:val="20"/>
+          <w:u w:val="none"/>
+        </w:rPr>
+        <w:t>⑦ Explainable TS forecasting</w:t>
       </w:r>
     </w:p>
     <w:p>

</xml_diff>

<commit_message>
Publications: add OneShot preprint (P4) on label-efficient TS anomaly detection
Homepage and CV updated together; the CV PDF/DOCX are rebuilt.
</commit_message>
<xml_diff>
--- a/SeunghanLee_CV.docx
+++ b/SeunghanLee_CV.docx
@@ -1530,7 +1530,7 @@
           <w:sz w:val="20"/>
           <w:u w:val="none"/>
         </w:rPr>
-        <w:t>Others (e.g., Self-Supervised Learning, Diffusion Models)</w:t>
+        <w:t>Others (e.g., Self-Supervised Learning, Diffusion Models, Anomaly Detection)</w:t>
       </w:r>
     </w:p>
     <w:p>
@@ -1659,7 +1659,7 @@
           <w:sz w:val="21"/>
           <w:u w:val="none"/>
         </w:rPr>
-        <w:t>27. Quantile Alignment Improves Zero-Shot Time-Series Foundation Models (2026)</w:t>
+        <w:t>28. OneShot: Label-Efficient Detector Weighting for Time Series Anomaly Detection (2026)</w:t>
       </w:r>
     </w:p>
     <w:p>
@@ -1674,7 +1674,7 @@
           <w:sz w:val="19"/>
           <w:u w:val="none"/>
         </w:rPr>
-        <w:t xml:space="preserve">- Junhyeok Kang, Sangjun Han, Jun Seo, </w:t>
+        <w:t xml:space="preserve">- </w:t>
       </w:r>
       <w:r>
         <w:rPr>
@@ -1694,7 +1694,7 @@
           <w:sz w:val="19"/>
           <w:u w:val="none"/>
         </w:rPr>
-        <w:t>, Jaehoon Lee, Dongwan Kang, Minjae Kim, Sungdong Yoo, Tae Yoon Lim, Hwanil Choi, Soonyoung Lee, Wonbin Ahn</w:t>
+        <w:t>, Jun Seo, Jaehoon Lee, Junhyeok Kang, Sangjun Han, Sungdong Yoo, Minjae Kim, Tae Yoon Lim, Dongwan Kang, Hwanil Choi, Soonyoung Lee, Wonbin Ahn</w:t>
       </w:r>
     </w:p>
     <w:p>
@@ -1720,74 +1720,21 @@
           <w:sz w:val="19"/>
           <w:u w:val="none"/>
         </w:rPr>
-        <w:t>NeurIPSW (FMTS), 2026. [TBD]</w:t>
-      </w:r>
-    </w:p>
-    <w:p>
-      <w:pPr>
-        <w:spacing w:before="176" w:after="20"/>
-      </w:pPr>
-      <w:r>
-        <w:rPr>
-          <w:rFonts w:ascii="Lato" w:hAnsi="Lato" w:eastAsia="Lato" w:cs="Lato"/>
-          <w:b/>
-          <w:i w:val="0"/>
-          <w:color w:val="0F3D57"/>
-          <w:sz w:val="21"/>
-          <w:u w:val="none"/>
-        </w:rPr>
-        <w:t>26. Composite Kernel Decomposition of Gaussian Process for Time-Series Foundation Models (2026)</w:t>
-      </w:r>
-    </w:p>
-    <w:p>
-      <w:pPr>
-        <w:spacing w:before="0" w:after="0"/>
-      </w:pPr>
-      <w:r>
-        <w:rPr>
-          <w:rFonts w:ascii="Lato" w:hAnsi="Lato" w:eastAsia="Lato" w:cs="Lato"/>
-          <w:b w:val="0"/>
-          <w:i w:val="0"/>
-          <w:sz w:val="19"/>
-          <w:u w:val="none"/>
-        </w:rPr>
-        <w:t xml:space="preserve">- Sangjun Han, Hyunoh Yeo, Joanie Hayoun Chung, Junhyeok Kang, </w:t>
-      </w:r>
-      <w:r>
-        <w:rPr>
-          <w:rFonts w:ascii="Lato" w:hAnsi="Lato" w:eastAsia="Lato" w:cs="Lato"/>
-          <w:b/>
-          <w:i w:val="0"/>
-          <w:sz w:val="19"/>
-          <w:u w:val="none"/>
-        </w:rPr>
-        <w:t>Seunghan Lee</w:t>
-      </w:r>
-      <w:r>
-        <w:rPr>
-          <w:rFonts w:ascii="Lato" w:hAnsi="Lato" w:eastAsia="Lato" w:cs="Lato"/>
-          <w:b w:val="0"/>
-          <w:i w:val="0"/>
-          <w:sz w:val="19"/>
-          <w:u w:val="none"/>
-        </w:rPr>
-        <w:t>, Jaehoon Lee, Jun Seo, Tae Yoon Lim, Dongwan Kang, Hwanil Choi, Minjae Kim, Sungdong Yoo, Soonyoung Lee, Wonbin Ahn</w:t>
-      </w:r>
-    </w:p>
-    <w:p>
-      <w:pPr>
-        <w:spacing w:before="0" w:after="0"/>
-      </w:pPr>
-      <w:r>
-        <w:rPr>
-          <w:rFonts w:ascii="Lato" w:hAnsi="Lato" w:eastAsia="Lato" w:cs="Lato"/>
-          <w:b w:val="0"/>
-          <w:i w:val="0"/>
-          <w:sz w:val="19"/>
-          <w:u w:val="none"/>
-        </w:rPr>
-        <w:t xml:space="preserve">- In </w:t>
-      </w:r>
+        <w:t>arXiv preprint, 2026. [</w:t>
+      </w:r>
+      <w:hyperlink r:id="rId16">
+        <w:r>
+          <w:rPr>
+            <w:rFonts w:ascii="Lato" w:hAnsi="Lato" w:eastAsia="Lato" w:cs="Lato"/>
+            <w:b w:val="0"/>
+            <w:i w:val="0"/>
+            <w:color w:val="0F3D57"/>
+            <w:sz w:val="19"/>
+            <w:u w:val="none"/>
+          </w:rPr>
+          <w:t>arxiv:2610.16219</w:t>
+        </w:r>
+      </w:hyperlink>
       <w:r>
         <w:rPr>
           <w:rFonts w:ascii="Lato" w:hAnsi="Lato" w:eastAsia="Lato" w:cs="Lato"/>
@@ -1797,7 +1744,7 @@
           <w:sz w:val="19"/>
           <w:u w:val="none"/>
         </w:rPr>
-        <w:t>NeurIPSW (FMTS), 2026. [TBD]</w:t>
+        <w:t>]</w:t>
       </w:r>
     </w:p>
     <w:p>
@@ -1813,7 +1760,7 @@
           <w:sz w:val="21"/>
           <w:u w:val="none"/>
         </w:rPr>
-        <w:t>25. EXAONE Demand 1.0: A Time Series Foundation Model for Demand Forecasting (2026)</w:t>
+        <w:t>27. Quantile Alignment Improves Zero-Shot Time-Series Foundation Models (2026)</w:t>
       </w:r>
     </w:p>
     <w:p>
@@ -1828,7 +1775,7 @@
           <w:sz w:val="19"/>
           <w:u w:val="none"/>
         </w:rPr>
-        <w:t xml:space="preserve">- </w:t>
+        <w:t xml:space="preserve">- Junhyeok Kang, Sangjun Han, Jun Seo, </w:t>
       </w:r>
       <w:r>
         <w:rPr>
@@ -1848,7 +1795,7 @@
           <w:sz w:val="19"/>
           <w:u w:val="none"/>
         </w:rPr>
-        <w:t>, Sangjun Han, Jun Seo, Junhyeok Kang, Jaehoon Lee, Tae Yoon Lim, Dongwan Kang, Hwanil Choi, Minjae Kim, Sungdong Yoo, Soonyoung Lee, Wonbin Ahn</w:t>
+        <w:t>, Jaehoon Lee, Dongwan Kang, Minjae Kim, Sungdong Yoo, Tae Yoon Lim, Hwanil Choi, Soonyoung Lee, Wonbin Ahn</w:t>
       </w:r>
     </w:p>
     <w:p>
@@ -1874,9 +1821,163 @@
           <w:sz w:val="19"/>
           <w:u w:val="none"/>
         </w:rPr>
+        <w:t>NeurIPSW (FMTS), 2026. [TBD]</w:t>
+      </w:r>
+    </w:p>
+    <w:p>
+      <w:pPr>
+        <w:spacing w:before="176" w:after="20"/>
+      </w:pPr>
+      <w:r>
+        <w:rPr>
+          <w:rFonts w:ascii="Lato" w:hAnsi="Lato" w:eastAsia="Lato" w:cs="Lato"/>
+          <w:b/>
+          <w:i w:val="0"/>
+          <w:color w:val="0F3D57"/>
+          <w:sz w:val="21"/>
+          <w:u w:val="none"/>
+        </w:rPr>
+        <w:t>26. Composite Kernel Decomposition of Gaussian Process for Time-Series Foundation Models (2026)</w:t>
+      </w:r>
+    </w:p>
+    <w:p>
+      <w:pPr>
+        <w:spacing w:before="0" w:after="0"/>
+      </w:pPr>
+      <w:r>
+        <w:rPr>
+          <w:rFonts w:ascii="Lato" w:hAnsi="Lato" w:eastAsia="Lato" w:cs="Lato"/>
+          <w:b w:val="0"/>
+          <w:i w:val="0"/>
+          <w:sz w:val="19"/>
+          <w:u w:val="none"/>
+        </w:rPr>
+        <w:t xml:space="preserve">- Sangjun Han, Hyunoh Yeo, Joanie Hayoun Chung, Junhyeok Kang, </w:t>
+      </w:r>
+      <w:r>
+        <w:rPr>
+          <w:rFonts w:ascii="Lato" w:hAnsi="Lato" w:eastAsia="Lato" w:cs="Lato"/>
+          <w:b/>
+          <w:i w:val="0"/>
+          <w:sz w:val="19"/>
+          <w:u w:val="none"/>
+        </w:rPr>
+        <w:t>Seunghan Lee</w:t>
+      </w:r>
+      <w:r>
+        <w:rPr>
+          <w:rFonts w:ascii="Lato" w:hAnsi="Lato" w:eastAsia="Lato" w:cs="Lato"/>
+          <w:b w:val="0"/>
+          <w:i w:val="0"/>
+          <w:sz w:val="19"/>
+          <w:u w:val="none"/>
+        </w:rPr>
+        <w:t>, Jaehoon Lee, Jun Seo, Tae Yoon Lim, Dongwan Kang, Hwanil Choi, Minjae Kim, Sungdong Yoo, Soonyoung Lee, Wonbin Ahn</w:t>
+      </w:r>
+    </w:p>
+    <w:p>
+      <w:pPr>
+        <w:spacing w:before="0" w:after="0"/>
+      </w:pPr>
+      <w:r>
+        <w:rPr>
+          <w:rFonts w:ascii="Lato" w:hAnsi="Lato" w:eastAsia="Lato" w:cs="Lato"/>
+          <w:b w:val="0"/>
+          <w:i w:val="0"/>
+          <w:sz w:val="19"/>
+          <w:u w:val="none"/>
+        </w:rPr>
+        <w:t xml:space="preserve">- In </w:t>
+      </w:r>
+      <w:r>
+        <w:rPr>
+          <w:rFonts w:ascii="Lato" w:hAnsi="Lato" w:eastAsia="Lato" w:cs="Lato"/>
+          <w:b w:val="0"/>
+          <w:i/>
+          <w:color w:val="4A4A4A"/>
+          <w:sz w:val="19"/>
+          <w:u w:val="none"/>
+        </w:rPr>
+        <w:t>NeurIPSW (FMTS), 2026. [TBD]</w:t>
+      </w:r>
+    </w:p>
+    <w:p>
+      <w:pPr>
+        <w:spacing w:before="176" w:after="20"/>
+      </w:pPr>
+      <w:r>
+        <w:rPr>
+          <w:rFonts w:ascii="Lato" w:hAnsi="Lato" w:eastAsia="Lato" w:cs="Lato"/>
+          <w:b/>
+          <w:i w:val="0"/>
+          <w:color w:val="0F3D57"/>
+          <w:sz w:val="21"/>
+          <w:u w:val="none"/>
+        </w:rPr>
+        <w:t>25. EXAONE Demand 1.0: A Time Series Foundation Model for Demand Forecasting (2026)</w:t>
+      </w:r>
+    </w:p>
+    <w:p>
+      <w:pPr>
+        <w:spacing w:before="0" w:after="0"/>
+      </w:pPr>
+      <w:r>
+        <w:rPr>
+          <w:rFonts w:ascii="Lato" w:hAnsi="Lato" w:eastAsia="Lato" w:cs="Lato"/>
+          <w:b w:val="0"/>
+          <w:i w:val="0"/>
+          <w:sz w:val="19"/>
+          <w:u w:val="none"/>
+        </w:rPr>
+        <w:t xml:space="preserve">- </w:t>
+      </w:r>
+      <w:r>
+        <w:rPr>
+          <w:rFonts w:ascii="Lato" w:hAnsi="Lato" w:eastAsia="Lato" w:cs="Lato"/>
+          <w:b/>
+          <w:i w:val="0"/>
+          <w:sz w:val="19"/>
+          <w:u w:val="none"/>
+        </w:rPr>
+        <w:t>Seunghan Lee</w:t>
+      </w:r>
+      <w:r>
+        <w:rPr>
+          <w:rFonts w:ascii="Lato" w:hAnsi="Lato" w:eastAsia="Lato" w:cs="Lato"/>
+          <w:b w:val="0"/>
+          <w:i w:val="0"/>
+          <w:sz w:val="19"/>
+          <w:u w:val="none"/>
+        </w:rPr>
+        <w:t>, Sangjun Han, Jun Seo, Junhyeok Kang, Jaehoon Lee, Tae Yoon Lim, Dongwan Kang, Hwanil Choi, Minjae Kim, Sungdong Yoo, Soonyoung Lee, Wonbin Ahn</w:t>
+      </w:r>
+    </w:p>
+    <w:p>
+      <w:pPr>
+        <w:spacing w:before="0" w:after="0"/>
+      </w:pPr>
+      <w:r>
+        <w:rPr>
+          <w:rFonts w:ascii="Lato" w:hAnsi="Lato" w:eastAsia="Lato" w:cs="Lato"/>
+          <w:b w:val="0"/>
+          <w:i w:val="0"/>
+          <w:sz w:val="19"/>
+          <w:u w:val="none"/>
+        </w:rPr>
+        <w:t xml:space="preserve">- In </w:t>
+      </w:r>
+      <w:r>
+        <w:rPr>
+          <w:rFonts w:ascii="Lato" w:hAnsi="Lato" w:eastAsia="Lato" w:cs="Lato"/>
+          <w:b w:val="0"/>
+          <w:i/>
+          <w:color w:val="4A4A4A"/>
+          <w:sz w:val="19"/>
+          <w:u w:val="none"/>
+        </w:rPr>
         <w:t>Technical report, 2026. [</w:t>
       </w:r>
-      <w:hyperlink r:id="rId16">
+      <w:hyperlink r:id="rId17">
         <w:r>
           <w:rPr>
             <w:rFonts w:ascii="Lato" w:hAnsi="Lato" w:eastAsia="Lato" w:cs="Lato"/>
@@ -1977,7 +2078,7 @@
         </w:rPr>
         <w:t>arXiv preprint, 2026. [</w:t>
       </w:r>
-      <w:hyperlink r:id="rId17">
+      <w:hyperlink r:id="rId18">
         <w:r>
           <w:rPr>
             <w:rFonts w:ascii="Lato" w:hAnsi="Lato" w:eastAsia="Lato" w:cs="Lato"/>
@@ -2078,7 +2179,7 @@
         </w:rPr>
         <w:t>Technical report, 2026. [</w:t>
       </w:r>
-      <w:hyperlink r:id="rId18">
+      <w:hyperlink r:id="rId19">
         <w:r>
           <w:rPr>
             <w:rFonts w:ascii="Lato" w:hAnsi="Lato" w:eastAsia="Lato" w:cs="Lato"/>
@@ -2179,7 +2280,7 @@
         </w:rPr>
         <w:t>NeurIPSW (XAI4Science), 2026. [</w:t>
       </w:r>
-      <w:hyperlink r:id="rId19">
+      <w:hyperlink r:id="rId20">
         <w:r>
           <w:rPr>
             <w:rFonts w:ascii="Lato" w:hAnsi="Lato" w:eastAsia="Lato" w:cs="Lato"/>
@@ -2280,7 +2381,7 @@
         </w:rPr>
         <w:t>Technical report, 2026. [</w:t>
       </w:r>
-      <w:hyperlink r:id="rId20">
+      <w:hyperlink r:id="rId21">
         <w:r>
           <w:rPr>
             <w:rFonts w:ascii="Lato" w:hAnsi="Lato" w:eastAsia="Lato" w:cs="Lato"/>
@@ -2381,7 +2482,7 @@
         </w:rPr>
         <w:t>arXiv preprint, 2026. [</w:t>
       </w:r>
-      <w:hyperlink r:id="rId21">
+      <w:hyperlink r:id="rId22">
         <w:r>
           <w:rPr>
             <w:rFonts w:ascii="Lato" w:hAnsi="Lato" w:eastAsia="Lato" w:cs="Lato"/>
@@ -2482,7 +2583,7 @@
         </w:rPr>
         <w:t>arXiv preprint, 2026. [</w:t>
       </w:r>
-      <w:hyperlink r:id="rId22">
+      <w:hyperlink r:id="rId23">
         <w:r>
           <w:rPr>
             <w:rFonts w:ascii="Lato" w:hAnsi="Lato" w:eastAsia="Lato" w:cs="Lato"/>
@@ -2583,7 +2684,7 @@
         </w:rPr>
         <w:t>EMNLP, 2026. [</w:t>
       </w:r>
-      <w:hyperlink r:id="rId23">
+      <w:hyperlink r:id="rId24">
         <w:r>
           <w:rPr>
             <w:rFonts w:ascii="Lato" w:hAnsi="Lato" w:eastAsia="Lato" w:cs="Lato"/>
@@ -2706,7 +2807,7 @@
         </w:rPr>
         <w:t>[</w:t>
       </w:r>
-      <w:hyperlink r:id="rId24">
+      <w:hyperlink r:id="rId25">
         <w:r>
           <w:rPr>
             <w:rFonts w:ascii="Lato" w:hAnsi="Lato" w:eastAsia="Lato" w:cs="Lato"/>
@@ -2807,7 +2908,7 @@
         </w:rPr>
         <w:t>EMNLP, 2026. [</w:t>
       </w:r>
-      <w:hyperlink r:id="rId25">
+      <w:hyperlink r:id="rId26">
         <w:r>
           <w:rPr>
             <w:rFonts w:ascii="Lato" w:hAnsi="Lato" w:eastAsia="Lato" w:cs="Lato"/>
@@ -2957,7 +3058,7 @@
         </w:rPr>
         <w:t>[</w:t>
       </w:r>
-      <w:hyperlink r:id="rId26">
+      <w:hyperlink r:id="rId27">
         <w:r>
           <w:rPr>
             <w:rFonts w:ascii="Lato" w:hAnsi="Lato" w:eastAsia="Lato" w:cs="Lato"/>
@@ -3080,7 +3181,7 @@
         </w:rPr>
         <w:t>[</w:t>
       </w:r>
-      <w:hyperlink r:id="rId27">
+      <w:hyperlink r:id="rId28">
         <w:r>
           <w:rPr>
             <w:rFonts w:ascii="Lato" w:hAnsi="Lato" w:eastAsia="Lato" w:cs="Lato"/>
@@ -3181,7 +3282,7 @@
         </w:rPr>
         <w:t>KDD, 2026. [</w:t>
       </w:r>
-      <w:hyperlink r:id="rId28">
+      <w:hyperlink r:id="rId29">
         <w:r>
           <w:rPr>
             <w:rFonts w:ascii="Lato" w:hAnsi="Lato" w:eastAsia="Lato" w:cs="Lato"/>
@@ -3272,7 +3373,7 @@
         </w:rPr>
         <w:t>ICML, 2026. [</w:t>
       </w:r>
-      <w:hyperlink r:id="rId29">
+      <w:hyperlink r:id="rId30">
         <w:r>
           <w:rPr>
             <w:rFonts w:ascii="Lato" w:hAnsi="Lato" w:eastAsia="Lato" w:cs="Lato"/>
@@ -3373,7 +3474,7 @@
         </w:rPr>
         <w:t>ICASSP, 2026. [</w:t>
       </w:r>
-      <w:hyperlink r:id="rId30">
+      <w:hyperlink r:id="rId31">
         <w:r>
           <w:rPr>
             <w:rFonts w:ascii="Lato" w:hAnsi="Lato" w:eastAsia="Lato" w:cs="Lato"/>
@@ -3583,7 +3684,7 @@
         </w:rPr>
         <w:t>ICML, 2025. [</w:t>
       </w:r>
-      <w:hyperlink r:id="rId31">
+      <w:hyperlink r:id="rId32">
         <w:r>
           <w:rPr>
             <w:rFonts w:ascii="Lato" w:hAnsi="Lato" w:eastAsia="Lato" w:cs="Lato"/>
@@ -3748,7 +3849,7 @@
         </w:rPr>
         <w:t>NeurIPSW (Time Series in the Age of Large Models) , 2024. [</w:t>
       </w:r>
-      <w:hyperlink r:id="rId32">
+      <w:hyperlink r:id="rId33">
         <w:r>
           <w:rPr>
             <w:rFonts w:ascii="Lato" w:hAnsi="Lato" w:eastAsia="Lato" w:cs="Lato"/>
@@ -3903,7 +4004,7 @@
         </w:rPr>
         <w:t>[</w:t>
       </w:r>
-      <w:hyperlink r:id="rId30">
+      <w:hyperlink r:id="rId31">
         <w:r>
           <w:rPr>
             <w:rFonts w:ascii="Lato" w:hAnsi="Lato" w:eastAsia="Lato" w:cs="Lato"/>
@@ -4036,7 +4137,7 @@
         </w:rPr>
         <w:t>NeurIPS, 2024. [</w:t>
       </w:r>
-      <w:hyperlink r:id="rId33">
+      <w:hyperlink r:id="rId34">
         <w:r>
           <w:rPr>
             <w:rFonts w:ascii="Lato" w:hAnsi="Lato" w:eastAsia="Lato" w:cs="Lato"/>
@@ -4183,7 +4284,7 @@
         </w:rPr>
         <w:t>ICLR, 2024. [</w:t>
       </w:r>
-      <w:hyperlink r:id="rId34">
+      <w:hyperlink r:id="rId35">
         <w:r>
           <w:rPr>
             <w:rFonts w:ascii="Lato" w:hAnsi="Lato" w:eastAsia="Lato" w:cs="Lato"/>
@@ -4333,7 +4434,7 @@
         </w:rPr>
         <w:t>[</w:t>
       </w:r>
-      <w:hyperlink r:id="rId35">
+      <w:hyperlink r:id="rId36">
         <w:r>
           <w:rPr>
             <w:rFonts w:ascii="Lato" w:hAnsi="Lato" w:eastAsia="Lato" w:cs="Lato"/>
@@ -7765,7 +7866,7 @@
         </w:rPr>
         <w:t>1st Semester: Contributed an article on AI in the Arts to IT Chosun (</w:t>
       </w:r>
-      <w:hyperlink r:id="rId36">
+      <w:hyperlink r:id="rId37">
         <w:r>
           <w:rPr>
             <w:rFonts w:ascii="Lato" w:hAnsi="Lato" w:eastAsia="Lato" w:cs="Lato"/>
@@ -13255,8 +13356,8 @@
       </w:r>
     </w:p>
     <w:sectPr>
-      <w:headerReference w:type="default" r:id="rId37"/>
-      <w:footerReference w:type="default" r:id="rId38"/>
+      <w:headerReference w:type="default" r:id="rId38"/>
+      <w:footerReference w:type="default" r:id="rId39"/>
       <w:pgSz w:w="11906" w:h="16838"/>
       <w:pgMar w:top="1020" w:right="964" w:bottom="1020" w:left="1077" w:header="0" w:footer="510" w:gutter="0"/>
       <w:cols w:space="720"/>

</xml_diff>

<commit_message>
Research Interests: split finance into its own top-level item
Add "AI for finance" with financial time series and financial language
models (C9, W13), since several finance papers are not time-series work.
Mirror the change in the CV.
</commit_message>
<xml_diff>
--- a/SeunghanLee_CV.docx
+++ b/SeunghanLee_CV.docx
@@ -1474,7 +1474,7 @@
           <w:sz w:val="20"/>
           <w:u w:val="none"/>
         </w:rPr>
-        <w:t>Financial Time Series</w:t>
+        <w:t>Representation Learning</w:t>
       </w:r>
     </w:p>
     <w:p>
@@ -1502,12 +1502,40 @@
           <w:sz w:val="20"/>
           <w:u w:val="none"/>
         </w:rPr>
-        <w:t>Representation Learning</w:t>
+        <w:t>Others (e.g., Self-Supervised Learning, Diffusion Models, Anomaly Detection)</w:t>
       </w:r>
     </w:p>
     <w:p>
       <w:pPr>
         <w:spacing w:before="0" w:after="0"/>
+        <w:ind w:left="662" w:hanging="331"/>
+      </w:pPr>
+      <w:r>
+        <w:rPr>
+          <w:rFonts w:ascii="Lato" w:hAnsi="Lato" w:eastAsia="Lato" w:cs="Lato"/>
+          <w:b w:val="0"/>
+          <w:i w:val="0"/>
+          <w:color w:val="0F3D57"/>
+          <w:sz w:val="17"/>
+          <w:u w:val="none"/>
+        </w:rPr>
+        <w:t>•</w:t>
+        <w:tab/>
+      </w:r>
+      <w:r>
+        <w:rPr>
+          <w:rFonts w:ascii="Lato" w:hAnsi="Lato" w:eastAsia="Lato" w:cs="Lato"/>
+          <w:b/>
+          <w:i w:val="0"/>
+          <w:sz w:val="20"/>
+          <w:u w:val="none"/>
+        </w:rPr>
+        <w:t>AI for Finance</w:t>
+      </w:r>
+    </w:p>
+    <w:p>
+      <w:pPr>
+        <w:spacing w:before="0" w:after="0"/>
         <w:ind w:left="1325" w:hanging="331"/>
       </w:pPr>
       <w:r>
@@ -1530,7 +1558,35 @@
           <w:sz w:val="20"/>
           <w:u w:val="none"/>
         </w:rPr>
-        <w:t>Others (e.g., Self-Supervised Learning, Diffusion Models, Anomaly Detection)</w:t>
+        <w:t>Financial Time Series</w:t>
+      </w:r>
+    </w:p>
+    <w:p>
+      <w:pPr>
+        <w:spacing w:before="0" w:after="0"/>
+        <w:ind w:left="1325" w:hanging="331"/>
+      </w:pPr>
+      <w:r>
+        <w:rPr>
+          <w:rFonts w:ascii="Lato" w:hAnsi="Lato" w:eastAsia="Lato" w:cs="Lato"/>
+          <w:b w:val="0"/>
+          <w:i w:val="0"/>
+          <w:color w:val="0F3D57"/>
+          <w:sz w:val="16"/>
+          <w:u w:val="none"/>
+        </w:rPr>
+        <w:t>◦</w:t>
+        <w:tab/>
+      </w:r>
+      <w:r>
+        <w:rPr>
+          <w:rFonts w:ascii="Lato" w:hAnsi="Lato" w:eastAsia="Lato" w:cs="Lato"/>
+          <w:b w:val="0"/>
+          <w:i w:val="0"/>
+          <w:sz w:val="20"/>
+          <w:u w:val="none"/>
+        </w:rPr>
+        <w:t>Financial Language Models</w:t>
       </w:r>
     </w:p>
     <w:p>

</xml_diff>

<commit_message>
Publications: add IV surface forecasting paper (W14, ICAIF 2026 Workshop on AI-Driven Market Microstructure)
Add W14 (co-author), update counts (28 / W14), financial time series refs, and CV.
</commit_message>
<xml_diff>
--- a/SeunghanLee_CV.docx
+++ b/SeunghanLee_CV.docx
@@ -1700,6 +1700,83 @@
           <w:u w:val="none"/>
         </w:rPr>
         <w:t>Co-corresponding Authors)</w:t>
+      </w:r>
+    </w:p>
+    <w:p>
+      <w:pPr>
+        <w:spacing w:before="176" w:after="20"/>
+      </w:pPr>
+      <w:r>
+        <w:rPr>
+          <w:rFonts w:ascii="Lato" w:hAnsi="Lato" w:eastAsia="Lato" w:cs="Lato"/>
+          <w:b/>
+          <w:i w:val="0"/>
+          <w:color w:val="0F3D57"/>
+          <w:sz w:val="21"/>
+          <w:u w:val="none"/>
+        </w:rPr>
+        <w:t>29. Implied Volatility Surface Forecasting Under Earnings-Driven Distribution Shift: Transfer from Ordinary Trading Days (2026)</w:t>
+      </w:r>
+    </w:p>
+    <w:p>
+      <w:pPr>
+        <w:spacing w:before="0" w:after="0"/>
+      </w:pPr>
+      <w:r>
+        <w:rPr>
+          <w:rFonts w:ascii="Lato" w:hAnsi="Lato" w:eastAsia="Lato" w:cs="Lato"/>
+          <w:b w:val="0"/>
+          <w:i w:val="0"/>
+          <w:sz w:val="19"/>
+          <w:u w:val="none"/>
+        </w:rPr>
+        <w:t xml:space="preserve">- Hyunoh Yeo, Jaehoon Lee, </w:t>
+      </w:r>
+      <w:r>
+        <w:rPr>
+          <w:rFonts w:ascii="Lato" w:hAnsi="Lato" w:eastAsia="Lato" w:cs="Lato"/>
+          <w:b/>
+          <w:i w:val="0"/>
+          <w:sz w:val="19"/>
+          <w:u w:val="none"/>
+        </w:rPr>
+        <w:t>Seunghan Lee</w:t>
+      </w:r>
+      <w:r>
+        <w:rPr>
+          <w:rFonts w:ascii="Lato" w:hAnsi="Lato" w:eastAsia="Lato" w:cs="Lato"/>
+          <w:b w:val="0"/>
+          <w:i w:val="0"/>
+          <w:sz w:val="19"/>
+          <w:u w:val="none"/>
+        </w:rPr>
+        <w:t>, Jun Seo, Junhyeok Kang, Sungdong Yoo, Minjae Kim, Tae Yoon Lim, Sangjun Han, Dongwan Kang, Hwanil Choi, Soonyoung Lee, Wonbin Ahn</w:t>
+      </w:r>
+    </w:p>
+    <w:p>
+      <w:pPr>
+        <w:spacing w:before="0" w:after="0"/>
+      </w:pPr>
+      <w:r>
+        <w:rPr>
+          <w:rFonts w:ascii="Lato" w:hAnsi="Lato" w:eastAsia="Lato" w:cs="Lato"/>
+          <w:b w:val="0"/>
+          <w:i w:val="0"/>
+          <w:sz w:val="19"/>
+          <w:u w:val="none"/>
+        </w:rPr>
+        <w:t xml:space="preserve">- In </w:t>
+      </w:r>
+      <w:r>
+        <w:rPr>
+          <w:rFonts w:ascii="Lato" w:hAnsi="Lato" w:eastAsia="Lato" w:cs="Lato"/>
+          <w:b w:val="0"/>
+          <w:i/>
+          <w:color w:val="4A4A4A"/>
+          <w:sz w:val="19"/>
+          <w:u w:val="none"/>
+        </w:rPr>
+        <w:t>ICAIFW (AI-Driven Market Microstructure in Centralized and Decentralized Finance), 2026. [TBD]</w:t>
       </w:r>
     </w:p>
     <w:p>

</xml_diff>

<commit_message>
Research Interests: merge agents into time-series reasoning & explainability
Homepage line becomes "Time-series reasoning, explainability & agents"
[P1, C8/W8, W10]; the CV's separate "Agentic Time Series Forecasting"
bullet is folded into the same item so both match.
</commit_message>
<xml_diff>
--- a/SeunghanLee_CV.docx
+++ b/SeunghanLee_CV.docx
@@ -1418,7 +1418,7 @@
           <w:sz w:val="20"/>
           <w:u w:val="none"/>
         </w:rPr>
-        <w:t>Agentic Time Series Forecasting</w:t>
+        <w:t>Time Series Foundation Models</w:t>
       </w:r>
     </w:p>
     <w:p>
@@ -1446,7 +1446,7 @@
           <w:sz w:val="20"/>
           <w:u w:val="none"/>
         </w:rPr>
-        <w:t>Time Series Foundation Models</w:t>
+        <w:t>Time Series Reasoning, Explainability &amp; Agents</w:t>
       </w:r>
     </w:p>
     <w:p>

</xml_diff>

<commit_message>
Publications: PALM (W13) selected as Oral at ICAIF 2026 Workshop
</commit_message>
<xml_diff>
--- a/SeunghanLee_CV.docx
+++ b/SeunghanLee_CV.docx
@@ -2209,7 +2209,29 @@
           <w:sz w:val="19"/>
           <w:u w:val="none"/>
         </w:rPr>
-        <w:t>ICAIFW (LLMs and Generative AI for Finance), 2026. [</w:t>
+        <w:t xml:space="preserve">ICAIFW (LLMs and Generative AI for Finance), 2026. </w:t>
+      </w:r>
+      <w:r>
+        <w:rPr>
+          <w:rFonts w:ascii="Lato" w:hAnsi="Lato" w:eastAsia="Lato" w:cs="Lato"/>
+          <w:b w:val="0"/>
+          <w:i w:val="0"/>
+          <w:color w:val="C4761A"/>
+          <w:sz w:val="19"/>
+          <w:u w:val="none"/>
+        </w:rPr>
+        <w:t xml:space="preserve">Oral </w:t>
+      </w:r>
+      <w:r>
+        <w:rPr>
+          <w:rFonts w:ascii="Lato" w:hAnsi="Lato" w:eastAsia="Lato" w:cs="Lato"/>
+          <w:b w:val="0"/>
+          <w:i/>
+          <w:color w:val="4A4A4A"/>
+          <w:sz w:val="19"/>
+          <w:u w:val="none"/>
+        </w:rPr>
+        <w:t>[</w:t>
       </w:r>
       <w:hyperlink r:id="rId18">
         <w:r>

</xml_diff>

<commit_message>
Publications: add DIVA preprint (P4) on decision-informed information seeking with LLMs
arXiv 2610.32181, first author. Counts 29 papers / 21 first-author;
new "LLMs for decision making" interest [C9, P4]; CV entry 30.
</commit_message>
<xml_diff>
--- a/SeunghanLee_CV.docx
+++ b/SeunghanLee_CV.docx
@@ -1614,6 +1614,34 @@
           <w:sz w:val="20"/>
           <w:u w:val="none"/>
         </w:rPr>
+        <w:t>LLMs for Decision Making</w:t>
+      </w:r>
+    </w:p>
+    <w:p>
+      <w:pPr>
+        <w:spacing w:before="0" w:after="0"/>
+        <w:ind w:left="662" w:hanging="331"/>
+      </w:pPr>
+      <w:r>
+        <w:rPr>
+          <w:rFonts w:ascii="Lato" w:hAnsi="Lato" w:eastAsia="Lato" w:cs="Lato"/>
+          <w:b w:val="0"/>
+          <w:i w:val="0"/>
+          <w:color w:val="0F3D57"/>
+          <w:sz w:val="17"/>
+          <w:u w:val="none"/>
+        </w:rPr>
+        <w:t>•</w:t>
+        <w:tab/>
+      </w:r>
+      <w:r>
+        <w:rPr>
+          <w:rFonts w:ascii="Lato" w:hAnsi="Lato" w:eastAsia="Lato" w:cs="Lato"/>
+          <w:b/>
+          <w:i w:val="0"/>
+          <w:sz w:val="20"/>
+          <w:u w:val="none"/>
+        </w:rPr>
         <w:t>Deep Learning for Tabular / Graphs</w:t>
       </w:r>
     </w:p>
@@ -1715,7 +1743,7 @@
           <w:sz w:val="21"/>
           <w:u w:val="none"/>
         </w:rPr>
-        <w:t>29. Implied Volatility Surface Forecasting Under Earnings-Driven Distribution Shift: Transfer from Ordinary Trading Days (2026)</w:t>
+        <w:t>30. Not All Information Is Worth Asking For: Decision-Informed Information Seeking with LLMs (2026)</w:t>
       </w:r>
     </w:p>
     <w:p>
@@ -1730,7 +1758,7 @@
           <w:sz w:val="19"/>
           <w:u w:val="none"/>
         </w:rPr>
-        <w:t xml:space="preserve">- Hyunoh Yeo, Jaehoon Lee, </w:t>
+        <w:t xml:space="preserve">- </w:t>
       </w:r>
       <w:r>
         <w:rPr>
@@ -1750,7 +1778,7 @@
           <w:sz w:val="19"/>
           <w:u w:val="none"/>
         </w:rPr>
-        <w:t>, Jun Seo, Junhyeok Kang, Sungdong Yoo, Minjae Kim, Tae Yoon Lim, Sangjun Han, Dongwan Kang, Hwanil Choi, Soonyoung Lee, Wonbin Ahn</w:t>
+        <w:t>, Jun Seo, Junhyeok Kang, Jaehoon Lee, Sangjun Han, Sungdong Yoo, Minjae Kim, Tae Yoon Lim, Dongwan Kang, Hwanil Choi, Soonyoung Lee, Wonbin Ahn</w:t>
       </w:r>
     </w:p>
     <w:p>
@@ -1776,74 +1804,21 @@
           <w:sz w:val="19"/>
           <w:u w:val="none"/>
         </w:rPr>
-        <w:t>ICAIFW (AI-Driven Market Microstructure in Centralized and Decentralized Finance), 2026. [TBD]</w:t>
-      </w:r>
-    </w:p>
-    <w:p>
-      <w:pPr>
-        <w:spacing w:before="176" w:after="20"/>
-      </w:pPr>
-      <w:r>
-        <w:rPr>
-          <w:rFonts w:ascii="Lato" w:hAnsi="Lato" w:eastAsia="Lato" w:cs="Lato"/>
-          <w:b/>
-          <w:i w:val="0"/>
-          <w:color w:val="0F3D57"/>
-          <w:sz w:val="21"/>
-          <w:u w:val="none"/>
-        </w:rPr>
-        <w:t>28. OneShot: Label-Efficient Detector Weighting for Time Series Anomaly Detection (2026)</w:t>
-      </w:r>
-    </w:p>
-    <w:p>
-      <w:pPr>
-        <w:spacing w:before="0" w:after="0"/>
-      </w:pPr>
-      <w:r>
-        <w:rPr>
-          <w:rFonts w:ascii="Lato" w:hAnsi="Lato" w:eastAsia="Lato" w:cs="Lato"/>
-          <w:b w:val="0"/>
-          <w:i w:val="0"/>
-          <w:sz w:val="19"/>
-          <w:u w:val="none"/>
-        </w:rPr>
-        <w:t xml:space="preserve">- </w:t>
-      </w:r>
-      <w:r>
-        <w:rPr>
-          <w:rFonts w:ascii="Lato" w:hAnsi="Lato" w:eastAsia="Lato" w:cs="Lato"/>
-          <w:b/>
-          <w:i w:val="0"/>
-          <w:sz w:val="19"/>
-          <w:u w:val="none"/>
-        </w:rPr>
-        <w:t>Seunghan Lee</w:t>
-      </w:r>
-      <w:r>
-        <w:rPr>
-          <w:rFonts w:ascii="Lato" w:hAnsi="Lato" w:eastAsia="Lato" w:cs="Lato"/>
-          <w:b w:val="0"/>
-          <w:i w:val="0"/>
-          <w:sz w:val="19"/>
-          <w:u w:val="none"/>
-        </w:rPr>
-        <w:t>, Jun Seo, Jaehoon Lee, Junhyeok Kang, Sangjun Han, Sungdong Yoo, Minjae Kim, Tae Yoon Lim, Dongwan Kang, Hwanil Choi, Soonyoung Lee, Wonbin Ahn</w:t>
-      </w:r>
-    </w:p>
-    <w:p>
-      <w:pPr>
-        <w:spacing w:before="0" w:after="0"/>
-      </w:pPr>
-      <w:r>
-        <w:rPr>
-          <w:rFonts w:ascii="Lato" w:hAnsi="Lato" w:eastAsia="Lato" w:cs="Lato"/>
-          <w:b w:val="0"/>
-          <w:i w:val="0"/>
-          <w:sz w:val="19"/>
-          <w:u w:val="none"/>
-        </w:rPr>
-        <w:t xml:space="preserve">- In </w:t>
-      </w:r>
+        <w:t>arXiv preprint, 2026. [</w:t>
+      </w:r>
+      <w:hyperlink r:id="rId16">
+        <w:r>
+          <w:rPr>
+            <w:rFonts w:ascii="Lato" w:hAnsi="Lato" w:eastAsia="Lato" w:cs="Lato"/>
+            <w:b w:val="0"/>
+            <w:i w:val="0"/>
+            <w:color w:val="0F3D57"/>
+            <w:sz w:val="19"/>
+            <w:u w:val="none"/>
+          </w:rPr>
+          <w:t>arxiv:2610.32181</w:t>
+        </w:r>
+      </w:hyperlink>
       <w:r>
         <w:rPr>
           <w:rFonts w:ascii="Lato" w:hAnsi="Lato" w:eastAsia="Lato" w:cs="Lato"/>
@@ -1853,9 +1828,163 @@
           <w:sz w:val="19"/>
           <w:u w:val="none"/>
         </w:rPr>
+        <w:t>]</w:t>
+      </w:r>
+    </w:p>
+    <w:p>
+      <w:pPr>
+        <w:spacing w:before="176" w:after="20"/>
+      </w:pPr>
+      <w:r>
+        <w:rPr>
+          <w:rFonts w:ascii="Lato" w:hAnsi="Lato" w:eastAsia="Lato" w:cs="Lato"/>
+          <w:b/>
+          <w:i w:val="0"/>
+          <w:color w:val="0F3D57"/>
+          <w:sz w:val="21"/>
+          <w:u w:val="none"/>
+        </w:rPr>
+        <w:t>29. Implied Volatility Surface Forecasting Under Earnings-Driven Distribution Shift: Transfer from Ordinary Trading Days (2026)</w:t>
+      </w:r>
+    </w:p>
+    <w:p>
+      <w:pPr>
+        <w:spacing w:before="0" w:after="0"/>
+      </w:pPr>
+      <w:r>
+        <w:rPr>
+          <w:rFonts w:ascii="Lato" w:hAnsi="Lato" w:eastAsia="Lato" w:cs="Lato"/>
+          <w:b w:val="0"/>
+          <w:i w:val="0"/>
+          <w:sz w:val="19"/>
+          <w:u w:val="none"/>
+        </w:rPr>
+        <w:t xml:space="preserve">- Hyunoh Yeo, Jaehoon Lee, </w:t>
+      </w:r>
+      <w:r>
+        <w:rPr>
+          <w:rFonts w:ascii="Lato" w:hAnsi="Lato" w:eastAsia="Lato" w:cs="Lato"/>
+          <w:b/>
+          <w:i w:val="0"/>
+          <w:sz w:val="19"/>
+          <w:u w:val="none"/>
+        </w:rPr>
+        <w:t>Seunghan Lee</w:t>
+      </w:r>
+      <w:r>
+        <w:rPr>
+          <w:rFonts w:ascii="Lato" w:hAnsi="Lato" w:eastAsia="Lato" w:cs="Lato"/>
+          <w:b w:val="0"/>
+          <w:i w:val="0"/>
+          <w:sz w:val="19"/>
+          <w:u w:val="none"/>
+        </w:rPr>
+        <w:t>, Jun Seo, Junhyeok Kang, Sungdong Yoo, Minjae Kim, Tae Yoon Lim, Sangjun Han, Dongwan Kang, Hwanil Choi, Soonyoung Lee, Wonbin Ahn</w:t>
+      </w:r>
+    </w:p>
+    <w:p>
+      <w:pPr>
+        <w:spacing w:before="0" w:after="0"/>
+      </w:pPr>
+      <w:r>
+        <w:rPr>
+          <w:rFonts w:ascii="Lato" w:hAnsi="Lato" w:eastAsia="Lato" w:cs="Lato"/>
+          <w:b w:val="0"/>
+          <w:i w:val="0"/>
+          <w:sz w:val="19"/>
+          <w:u w:val="none"/>
+        </w:rPr>
+        <w:t xml:space="preserve">- In </w:t>
+      </w:r>
+      <w:r>
+        <w:rPr>
+          <w:rFonts w:ascii="Lato" w:hAnsi="Lato" w:eastAsia="Lato" w:cs="Lato"/>
+          <w:b w:val="0"/>
+          <w:i/>
+          <w:color w:val="4A4A4A"/>
+          <w:sz w:val="19"/>
+          <w:u w:val="none"/>
+        </w:rPr>
+        <w:t>ICAIFW (AI-Driven Market Microstructure in Centralized and Decentralized Finance), 2026. [TBD]</w:t>
+      </w:r>
+    </w:p>
+    <w:p>
+      <w:pPr>
+        <w:spacing w:before="176" w:after="20"/>
+      </w:pPr>
+      <w:r>
+        <w:rPr>
+          <w:rFonts w:ascii="Lato" w:hAnsi="Lato" w:eastAsia="Lato" w:cs="Lato"/>
+          <w:b/>
+          <w:i w:val="0"/>
+          <w:color w:val="0F3D57"/>
+          <w:sz w:val="21"/>
+          <w:u w:val="none"/>
+        </w:rPr>
+        <w:t>28. OneShot: Label-Efficient Detector Weighting for Time Series Anomaly Detection (2026)</w:t>
+      </w:r>
+    </w:p>
+    <w:p>
+      <w:pPr>
+        <w:spacing w:before="0" w:after="0"/>
+      </w:pPr>
+      <w:r>
+        <w:rPr>
+          <w:rFonts w:ascii="Lato" w:hAnsi="Lato" w:eastAsia="Lato" w:cs="Lato"/>
+          <w:b w:val="0"/>
+          <w:i w:val="0"/>
+          <w:sz w:val="19"/>
+          <w:u w:val="none"/>
+        </w:rPr>
+        <w:t xml:space="preserve">- </w:t>
+      </w:r>
+      <w:r>
+        <w:rPr>
+          <w:rFonts w:ascii="Lato" w:hAnsi="Lato" w:eastAsia="Lato" w:cs="Lato"/>
+          <w:b/>
+          <w:i w:val="0"/>
+          <w:sz w:val="19"/>
+          <w:u w:val="none"/>
+        </w:rPr>
+        <w:t>Seunghan Lee</w:t>
+      </w:r>
+      <w:r>
+        <w:rPr>
+          <w:rFonts w:ascii="Lato" w:hAnsi="Lato" w:eastAsia="Lato" w:cs="Lato"/>
+          <w:b w:val="0"/>
+          <w:i w:val="0"/>
+          <w:sz w:val="19"/>
+          <w:u w:val="none"/>
+        </w:rPr>
+        <w:t>, Jun Seo, Jaehoon Lee, Junhyeok Kang, Sangjun Han, Sungdong Yoo, Minjae Kim, Tae Yoon Lim, Dongwan Kang, Hwanil Choi, Soonyoung Lee, Wonbin Ahn</w:t>
+      </w:r>
+    </w:p>
+    <w:p>
+      <w:pPr>
+        <w:spacing w:before="0" w:after="0"/>
+      </w:pPr>
+      <w:r>
+        <w:rPr>
+          <w:rFonts w:ascii="Lato" w:hAnsi="Lato" w:eastAsia="Lato" w:cs="Lato"/>
+          <w:b w:val="0"/>
+          <w:i w:val="0"/>
+          <w:sz w:val="19"/>
+          <w:u w:val="none"/>
+        </w:rPr>
+        <w:t xml:space="preserve">- In </w:t>
+      </w:r>
+      <w:r>
+        <w:rPr>
+          <w:rFonts w:ascii="Lato" w:hAnsi="Lato" w:eastAsia="Lato" w:cs="Lato"/>
+          <w:b w:val="0"/>
+          <w:i/>
+          <w:color w:val="4A4A4A"/>
+          <w:sz w:val="19"/>
+          <w:u w:val="none"/>
+        </w:rPr>
         <w:t>arXiv preprint, 2026. [</w:t>
       </w:r>
-      <w:hyperlink r:id="rId16">
+      <w:hyperlink r:id="rId17">
         <w:r>
           <w:rPr>
             <w:rFonts w:ascii="Lato" w:hAnsi="Lato" w:eastAsia="Lato" w:cs="Lato"/>
@@ -2110,7 +2239,7 @@
         </w:rPr>
         <w:t>Technical report, 2026. [</w:t>
       </w:r>
-      <w:hyperlink r:id="rId17">
+      <w:hyperlink r:id="rId18">
         <w:r>
           <w:rPr>
             <w:rFonts w:ascii="Lato" w:hAnsi="Lato" w:eastAsia="Lato" w:cs="Lato"/>
@@ -2233,7 +2362,7 @@
         </w:rPr>
         <w:t>[</w:t>
       </w:r>
-      <w:hyperlink r:id="rId18">
+      <w:hyperlink r:id="rId19">
         <w:r>
           <w:rPr>
             <w:rFonts w:ascii="Lato" w:hAnsi="Lato" w:eastAsia="Lato" w:cs="Lato"/>
@@ -2334,7 +2463,7 @@
         </w:rPr>
         <w:t>Technical report, 2026. [</w:t>
       </w:r>
-      <w:hyperlink r:id="rId19">
+      <w:hyperlink r:id="rId20">
         <w:r>
           <w:rPr>
             <w:rFonts w:ascii="Lato" w:hAnsi="Lato" w:eastAsia="Lato" w:cs="Lato"/>
@@ -2435,7 +2564,7 @@
         </w:rPr>
         <w:t>NeurIPSW (XAI4Science), 2026. [</w:t>
       </w:r>
-      <w:hyperlink r:id="rId20">
+      <w:hyperlink r:id="rId21">
         <w:r>
           <w:rPr>
             <w:rFonts w:ascii="Lato" w:hAnsi="Lato" w:eastAsia="Lato" w:cs="Lato"/>
@@ -2536,7 +2665,7 @@
         </w:rPr>
         <w:t>Technical report, 2026. [</w:t>
       </w:r>
-      <w:hyperlink r:id="rId21">
+      <w:hyperlink r:id="rId22">
         <w:r>
           <w:rPr>
             <w:rFonts w:ascii="Lato" w:hAnsi="Lato" w:eastAsia="Lato" w:cs="Lato"/>
@@ -2637,7 +2766,7 @@
         </w:rPr>
         <w:t>arXiv preprint, 2026. [</w:t>
       </w:r>
-      <w:hyperlink r:id="rId22">
+      <w:hyperlink r:id="rId23">
         <w:r>
           <w:rPr>
             <w:rFonts w:ascii="Lato" w:hAnsi="Lato" w:eastAsia="Lato" w:cs="Lato"/>
@@ -2738,7 +2867,7 @@
         </w:rPr>
         <w:t>arXiv preprint, 2026. [</w:t>
       </w:r>
-      <w:hyperlink r:id="rId23">
+      <w:hyperlink r:id="rId24">
         <w:r>
           <w:rPr>
             <w:rFonts w:ascii="Lato" w:hAnsi="Lato" w:eastAsia="Lato" w:cs="Lato"/>
@@ -2839,7 +2968,7 @@
         </w:rPr>
         <w:t>EMNLP, 2026. [</w:t>
       </w:r>
-      <w:hyperlink r:id="rId24">
+      <w:hyperlink r:id="rId25">
         <w:r>
           <w:rPr>
             <w:rFonts w:ascii="Lato" w:hAnsi="Lato" w:eastAsia="Lato" w:cs="Lato"/>
@@ -2962,7 +3091,7 @@
         </w:rPr>
         <w:t>[</w:t>
       </w:r>
-      <w:hyperlink r:id="rId25">
+      <w:hyperlink r:id="rId26">
         <w:r>
           <w:rPr>
             <w:rFonts w:ascii="Lato" w:hAnsi="Lato" w:eastAsia="Lato" w:cs="Lato"/>
@@ -3063,7 +3192,7 @@
         </w:rPr>
         <w:t>EMNLP, 2026. [</w:t>
       </w:r>
-      <w:hyperlink r:id="rId26">
+      <w:hyperlink r:id="rId27">
         <w:r>
           <w:rPr>
             <w:rFonts w:ascii="Lato" w:hAnsi="Lato" w:eastAsia="Lato" w:cs="Lato"/>
@@ -3213,7 +3342,7 @@
         </w:rPr>
         <w:t>[</w:t>
       </w:r>
-      <w:hyperlink r:id="rId27">
+      <w:hyperlink r:id="rId28">
         <w:r>
           <w:rPr>
             <w:rFonts w:ascii="Lato" w:hAnsi="Lato" w:eastAsia="Lato" w:cs="Lato"/>
@@ -3336,7 +3465,7 @@
         </w:rPr>
         <w:t>[</w:t>
       </w:r>
-      <w:hyperlink r:id="rId28">
+      <w:hyperlink r:id="rId29">
         <w:r>
           <w:rPr>
             <w:rFonts w:ascii="Lato" w:hAnsi="Lato" w:eastAsia="Lato" w:cs="Lato"/>
@@ -3437,7 +3566,7 @@
         </w:rPr>
         <w:t>KDD, 2026. [</w:t>
       </w:r>
-      <w:hyperlink r:id="rId29">
+      <w:hyperlink r:id="rId30">
         <w:r>
           <w:rPr>
             <w:rFonts w:ascii="Lato" w:hAnsi="Lato" w:eastAsia="Lato" w:cs="Lato"/>
@@ -3528,7 +3657,7 @@
         </w:rPr>
         <w:t>ICML, 2026. [</w:t>
       </w:r>
-      <w:hyperlink r:id="rId30">
+      <w:hyperlink r:id="rId31">
         <w:r>
           <w:rPr>
             <w:rFonts w:ascii="Lato" w:hAnsi="Lato" w:eastAsia="Lato" w:cs="Lato"/>
@@ -3629,7 +3758,7 @@
         </w:rPr>
         <w:t>ICASSP, 2026. [</w:t>
       </w:r>
-      <w:hyperlink r:id="rId31">
+      <w:hyperlink r:id="rId32">
         <w:r>
           <w:rPr>
             <w:rFonts w:ascii="Lato" w:hAnsi="Lato" w:eastAsia="Lato" w:cs="Lato"/>
@@ -3839,7 +3968,7 @@
         </w:rPr>
         <w:t>ICML, 2025. [</w:t>
       </w:r>
-      <w:hyperlink r:id="rId32">
+      <w:hyperlink r:id="rId33">
         <w:r>
           <w:rPr>
             <w:rFonts w:ascii="Lato" w:hAnsi="Lato" w:eastAsia="Lato" w:cs="Lato"/>
@@ -4004,7 +4133,7 @@
         </w:rPr>
         <w:t>NeurIPSW (Time Series in the Age of Large Models) , 2024. [</w:t>
       </w:r>
-      <w:hyperlink r:id="rId33">
+      <w:hyperlink r:id="rId34">
         <w:r>
           <w:rPr>
             <w:rFonts w:ascii="Lato" w:hAnsi="Lato" w:eastAsia="Lato" w:cs="Lato"/>
@@ -4159,7 +4288,7 @@
         </w:rPr>
         <w:t>[</w:t>
       </w:r>
-      <w:hyperlink r:id="rId31">
+      <w:hyperlink r:id="rId32">
         <w:r>
           <w:rPr>
             <w:rFonts w:ascii="Lato" w:hAnsi="Lato" w:eastAsia="Lato" w:cs="Lato"/>
@@ -4292,7 +4421,7 @@
         </w:rPr>
         <w:t>NeurIPS, 2024. [</w:t>
       </w:r>
-      <w:hyperlink r:id="rId34">
+      <w:hyperlink r:id="rId35">
         <w:r>
           <w:rPr>
             <w:rFonts w:ascii="Lato" w:hAnsi="Lato" w:eastAsia="Lato" w:cs="Lato"/>
@@ -4439,7 +4568,7 @@
         </w:rPr>
         <w:t>ICLR, 2024. [</w:t>
       </w:r>
-      <w:hyperlink r:id="rId35">
+      <w:hyperlink r:id="rId36">
         <w:r>
           <w:rPr>
             <w:rFonts w:ascii="Lato" w:hAnsi="Lato" w:eastAsia="Lato" w:cs="Lato"/>
@@ -4589,7 +4718,7 @@
         </w:rPr>
         <w:t>[</w:t>
       </w:r>
-      <w:hyperlink r:id="rId36">
+      <w:hyperlink r:id="rId37">
         <w:r>
           <w:rPr>
             <w:rFonts w:ascii="Lato" w:hAnsi="Lato" w:eastAsia="Lato" w:cs="Lato"/>
@@ -8021,7 +8150,7 @@
         </w:rPr>
         <w:t>1st Semester: Contributed an article on AI in the Arts to IT Chosun (</w:t>
       </w:r>
-      <w:hyperlink r:id="rId37">
+      <w:hyperlink r:id="rId38">
         <w:r>
           <w:rPr>
             <w:rFonts w:ascii="Lato" w:hAnsi="Lato" w:eastAsia="Lato" w:cs="Lato"/>
@@ -13511,8 +13640,8 @@
       </w:r>
     </w:p>
     <w:sectPr>
-      <w:headerReference w:type="default" r:id="rId38"/>
-      <w:footerReference w:type="default" r:id="rId39"/>
+      <w:headerReference w:type="default" r:id="rId39"/>
+      <w:footerReference w:type="default" r:id="rId40"/>
       <w:pgSz w:w="11906" w:h="16838"/>
       <w:pgMar w:top="1020" w:right="964" w:bottom="1020" w:left="1077" w:header="0" w:footer="510" w:gutter="0"/>
       <w:cols w:space="720"/>

</xml_diff>